<commit_message>
docs: update revenue projection and bizplan materials
Co-Authored-By: Claude Opus 4.6 (1M context) <noreply@anthropic.com>
</commit_message>
<xml_diff>
--- a/docs/예창패 실제 제풀용/claudecode/2026년 예비창업패키지 사업계획서_페르소닉AI_수정중_SOM수정_cc_BM수정.docx
+++ b/docs/예창패 실제 제풀용/claudecode/2026년 예비창업패키지 사업계획서_페르소닉AI_수정중_SOM수정_cc_BM수정.docx
@@ -16170,8 +16170,18 @@
                 <w:sz w:val="20"/>
                 <w:szCs w:val="20"/>
               </w:rPr>
-              <w:t>정부지원금</w:t>
-            </w:r>
+              <w:t>민간투자+</w:t>
+            </w:r>
+            <w:proofErr w:type="spellStart"/>
+            <w:r>
+              <w:rPr>
+                <w:rFonts w:ascii="맑은 고딕" w:eastAsia="맑은 고딕" w:hAnsi="맑은 고딕" w:hint="eastAsia"/>
+                <w:sz w:val="20"/>
+                <w:szCs w:val="20"/>
+              </w:rPr>
+              <w:t>정부매칭</w:t>
+            </w:r>
+            <w:proofErr w:type="spellEnd"/>
           </w:p>
         </w:tc>
         <w:tc>
@@ -16192,7 +16202,7 @@
                 <w:sz w:val="20"/>
                 <w:szCs w:val="20"/>
               </w:rPr>
-              <w:t>초기창업패키지</w:t>
+              <w:t>TIPS(민간투자1억+정부최대6억)</w:t>
             </w:r>
           </w:p>
         </w:tc>
@@ -16216,7 +16226,7 @@
                 <w:sz w:val="20"/>
                 <w:szCs w:val="20"/>
               </w:rPr>
-              <w:t>1억원</w:t>
+              <w:t>최대 7억원</w:t>
             </w:r>
           </w:p>
         </w:tc>
@@ -16233,6 +16243,7 @@
             <w:pPr>
               <w:jc w:val="center"/>
               <w:rPr>
+                <w:rFonts w:ascii="맑은 고딕" w:eastAsia="맑은 고딕" w:hAnsi="맑은 고딕" w:hint="eastAsia"/>
                 <w:sz w:val="20"/>
                 <w:szCs w:val="20"/>
               </w:rPr>
@@ -16257,28 +16268,19 @@
           <w:p>
             <w:pPr>
               <w:rPr>
-                <w:sz w:val="20"/>
-                <w:szCs w:val="20"/>
-              </w:rPr>
-            </w:pPr>
-            <w:r>
-              <w:rPr>
                 <w:rFonts w:ascii="맑은 고딕" w:eastAsia="맑은 고딕" w:hAnsi="맑은 고딕" w:hint="eastAsia"/>
                 <w:sz w:val="20"/>
                 <w:szCs w:val="20"/>
               </w:rPr>
-              <w:t>민간투자+</w:t>
-            </w:r>
-            <w:proofErr w:type="spellStart"/>
+            </w:pPr>
             <w:r>
               <w:rPr>
                 <w:rFonts w:ascii="맑은 고딕" w:eastAsia="맑은 고딕" w:hAnsi="맑은 고딕" w:hint="eastAsia"/>
                 <w:sz w:val="20"/>
                 <w:szCs w:val="20"/>
               </w:rPr>
-              <w:t>정부매칭</w:t>
-            </w:r>
-            <w:proofErr w:type="spellEnd"/>
+              <w:t>민간투자</w:t>
+            </w:r>
           </w:p>
         </w:tc>
         <w:tc>
@@ -16289,17 +16291,18 @@
             <w:pPr>
               <w:jc w:val="center"/>
               <w:rPr>
-                <w:sz w:val="20"/>
-                <w:szCs w:val="20"/>
-              </w:rPr>
-            </w:pPr>
-            <w:r>
-              <w:rPr>
                 <w:rFonts w:ascii="맑은 고딕" w:eastAsia="맑은 고딕" w:hAnsi="맑은 고딕" w:hint="eastAsia"/>
                 <w:sz w:val="20"/>
                 <w:szCs w:val="20"/>
               </w:rPr>
-              <w:t>TIPS(민간투자1억+정부최대6억)</w:t>
+            </w:pPr>
+            <w:r>
+              <w:rPr>
+                <w:rFonts w:ascii="맑은 고딕" w:eastAsia="맑은 고딕" w:hAnsi="맑은 고딕" w:hint="eastAsia"/>
+                <w:sz w:val="20"/>
+                <w:szCs w:val="20"/>
+              </w:rPr>
+              <w:t>시리즈A</w:t>
             </w:r>
           </w:p>
         </w:tc>
@@ -16313,17 +16316,18 @@
           <w:p>
             <w:pPr>
               <w:rPr>
-                <w:sz w:val="20"/>
-                <w:szCs w:val="20"/>
-              </w:rPr>
-            </w:pPr>
-            <w:r>
-              <w:rPr>
                 <w:rFonts w:ascii="맑은 고딕" w:eastAsia="맑은 고딕" w:hAnsi="맑은 고딕" w:hint="eastAsia"/>
                 <w:sz w:val="20"/>
                 <w:szCs w:val="20"/>
               </w:rPr>
-              <w:t>최대 7억원</w:t>
+            </w:pPr>
+            <w:r>
+              <w:rPr>
+                <w:rFonts w:ascii="맑은 고딕" w:eastAsia="맑은 고딕" w:hAnsi="맑은 고딕" w:hint="eastAsia"/>
+                <w:sz w:val="20"/>
+                <w:szCs w:val="20"/>
+              </w:rPr>
+              <w:t>약5억원</w:t>
             </w:r>
           </w:p>
         </w:tc>
@@ -16840,8 +16844,7 @@
       </w:tblPr>
       <w:tblGrid>
         <w:gridCol w:w="1702"/>
-        <w:gridCol w:w="3118"/>
-        <w:gridCol w:w="6237"/>
+        <w:gridCol w:w="9355"/>
       </w:tblGrid>
       <w:tr>
         <w:trPr>
@@ -16879,7 +16882,6 @@
         <w:tc>
           <w:tcPr>
             <w:tcW w:w="9355" w:type="dxa"/>
-            <w:gridSpan w:val="2"/>
             <w:shd w:val="clear" w:color="auto" w:fill="F2F2F2" w:themeFill="background1" w:themeFillShade="F2"/>
           </w:tcPr>
           <w:p>
@@ -16938,7 +16940,6 @@
         <w:tc>
           <w:tcPr>
             <w:tcW w:w="9355" w:type="dxa"/>
-            <w:gridSpan w:val="2"/>
           </w:tcPr>
           <w:p>
             <w:pPr>
@@ -16991,7 +16992,6 @@
         <w:tc>
           <w:tcPr>
             <w:tcW w:w="9355" w:type="dxa"/>
-            <w:gridSpan w:val="2"/>
           </w:tcPr>
           <w:p>
             <w:pPr>
@@ -17052,7 +17052,6 @@
         <w:tc>
           <w:tcPr>
             <w:tcW w:w="9355" w:type="dxa"/>
-            <w:gridSpan w:val="2"/>
           </w:tcPr>
           <w:p>
             <w:pPr>
@@ -17172,6 +17171,20 @@
           </w:p>
         </w:tc>
       </w:tr>
+    </w:tbl>
+    <w:p/>
+    <w:tbl>
+      <w:tblPr>
+        <w:tblStyle w:val="a8"/>
+        <w:tblW w:w="11057" w:type="dxa"/>
+        <w:tblInd w:w="-601" w:type="dxa"/>
+        <w:tblLook w:val="04A0" w:firstRow="1" w:lastRow="0" w:firstColumn="1" w:lastColumn="0" w:noHBand="0" w:noVBand="1"/>
+      </w:tblPr>
+      <w:tblGrid>
+        <w:gridCol w:w="1702"/>
+        <w:gridCol w:w="3118"/>
+        <w:gridCol w:w="6237"/>
+      </w:tblGrid>
       <w:tr>
         <w:trPr>
           <w:trHeight w:val="283"/>

</xml_diff>

<commit_message>
docs: update business plan revenue and fundraising
</commit_message>
<xml_diff>
--- a/docs/예창패 실제 제풀용/claudecode/2026년 예비창업패키지 사업계획서_페르소닉AI_수정중_SOM수정_cc_BM수정.docx
+++ b/docs/예창패 실제 제풀용/claudecode/2026년 예비창업패키지 사업계획서_페르소닉AI_수정중_SOM수정_cc_BM수정.docx
@@ -4987,10 +4987,7 @@
         </w:rPr>
       </w:pPr>
       <w:r>
-        <w:rPr>
-          <w:rFonts w:asciiTheme="minorEastAsia" w:eastAsiaTheme="minorEastAsia" w:hAnsiTheme="minorEastAsia"/>
-        </w:rPr>
-        <w:t>SOM 산정 근거 — 합성 페르소나 카테고리는 주요 4-5개사에 $163M 이상이 투자된 형성 초기 시장이다. 지배적 플레이어가 아직 없으므로, 당사는 SAM의 약 5%인 약 $63M(약 882억원)을 3-5년 내 획득 가능 시장으로 설정하였다. 29년 $5M(약 70억원)을 단기 매출 목표로 설정하고, 중장기적으로 SOM 달성을 지향한다.</w:t>
+        <w:t>SOM 산정 근거 — 합성 페르소나 카테고리는 주요 4-5개사에 $163M 이상이 투자된 형성 초기 시장이다. 지배적 플레이어가 아직 없으므로, 당사는 SAM의 약 5%인 약 $63M(약 882억원)을 3-5년 내 획득 가능 시장으로 설정하였다. 29년 $10.5M(약 147억원)을 단기 매출 목표로 설정하고, 중장기적으로 SOM 달성을 지향한다.</w:t>
       </w:r>
     </w:p>
     <w:p>
@@ -13973,57 +13970,7 @@
         </w:rPr>
       </w:pPr>
       <w:r>
-        <w:rPr>
-          <w:rFonts w:asciiTheme="minorEastAsia" w:eastAsiaTheme="minorEastAsia" w:hAnsiTheme="minorEastAsia"/>
-          <w:b/>
-          <w:bCs/>
-        </w:rPr>
-        <w:t xml:space="preserve">매출 </w:t>
-      </w:r>
-      <w:proofErr w:type="gramStart"/>
-      <w:r>
-        <w:rPr>
-          <w:rFonts w:asciiTheme="minorEastAsia" w:eastAsiaTheme="minorEastAsia" w:hAnsiTheme="minorEastAsia"/>
-          <w:b/>
-          <w:bCs/>
-        </w:rPr>
-        <w:t>추정 :</w:t>
-      </w:r>
-      <w:proofErr w:type="gramEnd"/>
-      <w:r>
-        <w:rPr>
-          <w:rFonts w:asciiTheme="minorEastAsia" w:eastAsiaTheme="minorEastAsia" w:hAnsiTheme="minorEastAsia"/>
-          <w:b/>
-          <w:bCs/>
-        </w:rPr>
-        <w:t xml:space="preserve"> </w:t>
-      </w:r>
-      <w:r>
-        <w:rPr>
-          <w:rFonts w:asciiTheme="minorEastAsia" w:eastAsiaTheme="minorEastAsia" w:hAnsiTheme="minorEastAsia"/>
-        </w:rPr>
-        <w:t xml:space="preserve">위 건당 손익 구조를 기반으로, 27년 400명(ARPU $625), 28년 1,500명($833), 29년 4,000명($1,250)으로 고객을 확대하며, 건별 과금에서 구독·엔터프라이즈 계약으로 </w:t>
-      </w:r>
-      <w:r>
-        <w:rPr>
-          <w:rFonts w:asciiTheme="minorEastAsia" w:eastAsiaTheme="minorEastAsia" w:hAnsiTheme="minorEastAsia"/>
-        </w:rPr>
-        <w:lastRenderedPageBreak/>
-        <w:t xml:space="preserve">채널을 확장한다. 이에 더해 여론·시장반응 시뮬레이션, A/B 테스트, 전문가 리뷰 등 유형 확장과 모바일 앱 플랫폼 확장을 단계적으로 추진한다. 판관비를 반영한 3개년 영업이익 </w:t>
-      </w:r>
-      <w:proofErr w:type="spellStart"/>
-      <w:r>
-        <w:rPr>
-          <w:rFonts w:asciiTheme="minorEastAsia" w:eastAsiaTheme="minorEastAsia" w:hAnsiTheme="minorEastAsia"/>
-        </w:rPr>
-        <w:t>프로젝션은</w:t>
-      </w:r>
-      <w:proofErr w:type="spellEnd"/>
-      <w:r>
-        <w:rPr>
-          <w:rFonts w:asciiTheme="minorEastAsia" w:eastAsiaTheme="minorEastAsia" w:hAnsiTheme="minorEastAsia"/>
-        </w:rPr>
-        <w:t xml:space="preserve"> 다음과 같다.</w:t>
+        <w:t>매출 추정 : 매출은 연간 유료 판매건수와 평균 판매단가를 기준으로 산정하였다. 27년 580건($500), 28년 3,000건($1,000), 29년 7,000건($1,500)의 유료 판매를 목표로 한다. 27년에는 온라인 광고를 중심으로 초기 판매건수를 빠르게 확보하고, 28년부터는 콘텐츠 자산 축적, 커뮤니티 유입, 오가닉 검색, PLG 활성화에 따라 비광고 판매 비중을 높인다. 온라인 광고는 방문 대비 결제 전환율 1%, 평균 CPC $5.58을 적용하였다. 이에 따라 유료광고 기여 비중은 27년 85%, 28년 75%, 29년 70%로 설정하고, 나머지 15~30%는 콘텐츠·오가닉·PLG가 담당하는 구조로 설계하였다. 27년은 적자를 허용하되, 28년에는 손익분기 수준의 흑자 전환, 29년에는 20% 수준의 영업이익률 확보를 목표로 한다.</w:t>
       </w:r>
     </w:p>
     <w:tbl>
@@ -14049,20 +13996,7 @@
             <w:shd w:val="clear" w:color="auto" w:fill="F2F2F2" w:themeFill="background1" w:themeFillShade="F2"/>
           </w:tcPr>
           <w:p>
-            <w:pPr>
-              <w:jc w:val="center"/>
-              <w:rPr>
-                <w:sz w:val="20"/>
-                <w:szCs w:val="24"/>
-              </w:rPr>
-            </w:pPr>
-            <w:r>
-              <w:rPr>
-                <w:rFonts w:ascii="맑은 고딕" w:eastAsia="맑은 고딕" w:hAnsi="맑은 고딕"/>
-                <w:b/>
-                <w:sz w:val="20"/>
-                <w:szCs w:val="24"/>
-              </w:rPr>
+            <w:r>
               <w:t>구분</w:t>
             </w:r>
           </w:p>
@@ -14073,20 +14007,7 @@
             <w:shd w:val="clear" w:color="auto" w:fill="F2F2F2" w:themeFill="background1" w:themeFillShade="F2"/>
           </w:tcPr>
           <w:p>
-            <w:pPr>
-              <w:jc w:val="center"/>
-              <w:rPr>
-                <w:sz w:val="20"/>
-                <w:szCs w:val="24"/>
-              </w:rPr>
-            </w:pPr>
-            <w:r>
-              <w:rPr>
-                <w:rFonts w:ascii="맑은 고딕" w:eastAsia="맑은 고딕" w:hAnsi="맑은 고딕"/>
-                <w:b/>
-                <w:sz w:val="20"/>
-                <w:szCs w:val="24"/>
-              </w:rPr>
+            <w:r>
               <w:t>27년</w:t>
             </w:r>
           </w:p>
@@ -14097,20 +14018,7 @@
             <w:shd w:val="clear" w:color="auto" w:fill="F2F2F2" w:themeFill="background1" w:themeFillShade="F2"/>
           </w:tcPr>
           <w:p>
-            <w:pPr>
-              <w:jc w:val="center"/>
-              <w:rPr>
-                <w:sz w:val="20"/>
-                <w:szCs w:val="24"/>
-              </w:rPr>
-            </w:pPr>
-            <w:r>
-              <w:rPr>
-                <w:rFonts w:ascii="맑은 고딕" w:eastAsia="맑은 고딕" w:hAnsi="맑은 고딕"/>
-                <w:b/>
-                <w:sz w:val="20"/>
-                <w:szCs w:val="24"/>
-              </w:rPr>
+            <w:r>
               <w:t>28년</w:t>
             </w:r>
           </w:p>
@@ -14121,20 +14029,7 @@
             <w:shd w:val="clear" w:color="auto" w:fill="F2F2F2" w:themeFill="background1" w:themeFillShade="F2"/>
           </w:tcPr>
           <w:p>
-            <w:pPr>
-              <w:jc w:val="center"/>
-              <w:rPr>
-                <w:sz w:val="20"/>
-                <w:szCs w:val="24"/>
-              </w:rPr>
-            </w:pPr>
-            <w:r>
-              <w:rPr>
-                <w:rFonts w:ascii="맑은 고딕" w:eastAsia="맑은 고딕" w:hAnsi="맑은 고딕"/>
-                <w:b/>
-                <w:sz w:val="20"/>
-                <w:szCs w:val="24"/>
-              </w:rPr>
+            <w:r>
               <w:t>29년</w:t>
             </w:r>
           </w:p>
@@ -14149,29 +14044,8 @@
             <w:tcW w:w="2836" w:type="dxa"/>
           </w:tcPr>
           <w:p>
-            <w:pPr>
-              <w:rPr>
-                <w:sz w:val="20"/>
-                <w:szCs w:val="24"/>
-              </w:rPr>
-            </w:pPr>
-            <w:r>
-              <w:rPr>
-                <w:rFonts w:ascii="맑은 고딕" w:eastAsia="맑은 고딕" w:hAnsi="맑은 고딕"/>
-                <w:b/>
-                <w:sz w:val="20"/>
-                <w:szCs w:val="24"/>
-              </w:rPr>
-              <w:t>매출</w:t>
-            </w:r>
-            <w:r>
-              <w:rPr>
-                <w:rFonts w:ascii="맑은 고딕" w:eastAsia="맑은 고딕" w:hAnsi="맑은 고딕" w:hint="eastAsia"/>
-                <w:b/>
-                <w:sz w:val="20"/>
-                <w:szCs w:val="24"/>
-              </w:rPr>
-              <w:t>액</w:t>
+            <w:r>
+              <w:t>연간 유료 판매건수</w:t>
             </w:r>
           </w:p>
         </w:tc>
@@ -14180,22 +14054,8 @@
             <w:tcW w:w="2693" w:type="dxa"/>
           </w:tcPr>
           <w:p>
-            <w:pPr>
-              <w:jc w:val="center"/>
-              <w:rPr>
-                <w:bCs/>
-                <w:sz w:val="20"/>
-                <w:szCs w:val="24"/>
-              </w:rPr>
-            </w:pPr>
-            <w:r>
-              <w:rPr>
-                <w:rFonts w:ascii="맑은 고딕" w:eastAsia="맑은 고딕" w:hAnsi="맑은 고딕"/>
-                <w:bCs/>
-                <w:sz w:val="20"/>
-                <w:szCs w:val="24"/>
-              </w:rPr>
-              <w:t>$250K</w:t>
+            <w:r>
+              <w:t>580건</w:t>
             </w:r>
           </w:p>
         </w:tc>
@@ -14204,22 +14064,8 @@
             <w:tcW w:w="2126" w:type="dxa"/>
           </w:tcPr>
           <w:p>
-            <w:pPr>
-              <w:jc w:val="center"/>
-              <w:rPr>
-                <w:bCs/>
-                <w:sz w:val="20"/>
-                <w:szCs w:val="24"/>
-              </w:rPr>
-            </w:pPr>
-            <w:r>
-              <w:rPr>
-                <w:rFonts w:ascii="맑은 고딕" w:eastAsia="맑은 고딕" w:hAnsi="맑은 고딕"/>
-                <w:bCs/>
-                <w:sz w:val="20"/>
-                <w:szCs w:val="24"/>
-              </w:rPr>
-              <w:t>$1,250K</w:t>
+            <w:r>
+              <w:t>3,000건</w:t>
             </w:r>
           </w:p>
         </w:tc>
@@ -14228,22 +14074,8 @@
             <w:tcW w:w="3402" w:type="dxa"/>
           </w:tcPr>
           <w:p>
-            <w:pPr>
-              <w:jc w:val="center"/>
-              <w:rPr>
-                <w:bCs/>
-                <w:sz w:val="20"/>
-                <w:szCs w:val="24"/>
-              </w:rPr>
-            </w:pPr>
-            <w:r>
-              <w:rPr>
-                <w:rFonts w:ascii="맑은 고딕" w:eastAsia="맑은 고딕" w:hAnsi="맑은 고딕"/>
-                <w:bCs/>
-                <w:sz w:val="20"/>
-                <w:szCs w:val="24"/>
-              </w:rPr>
-              <w:t>$5,000K</w:t>
+            <w:r>
+              <w:t>7,000건</w:t>
             </w:r>
           </w:p>
         </w:tc>
@@ -14257,30 +14089,8 @@
             <w:tcW w:w="2836" w:type="dxa"/>
           </w:tcPr>
           <w:p>
-            <w:pPr>
-              <w:ind w:firstLineChars="100" w:firstLine="200"/>
-              <w:rPr>
-                <w:sz w:val="20"/>
-                <w:szCs w:val="24"/>
-              </w:rPr>
-            </w:pPr>
-            <w:proofErr w:type="spellStart"/>
-            <w:r>
-              <w:rPr>
-                <w:rFonts w:ascii="맑은 고딕" w:eastAsia="맑은 고딕" w:hAnsi="맑은 고딕"/>
-                <w:sz w:val="20"/>
-                <w:szCs w:val="24"/>
-              </w:rPr>
-              <w:t>셀프서브</w:t>
-            </w:r>
-            <w:proofErr w:type="spellEnd"/>
-            <w:r>
-              <w:rPr>
-                <w:rFonts w:ascii="맑은 고딕" w:eastAsia="맑은 고딕" w:hAnsi="맑은 고딕"/>
-                <w:sz w:val="20"/>
-                <w:szCs w:val="24"/>
-              </w:rPr>
-              <w:t>(건별)</w:t>
+            <w:r>
+              <w:t>평균 판매단가</w:t>
             </w:r>
           </w:p>
         </w:tc>
@@ -14289,22 +14099,8 @@
             <w:tcW w:w="2693" w:type="dxa"/>
           </w:tcPr>
           <w:p>
-            <w:pPr>
-              <w:jc w:val="center"/>
-              <w:rPr>
-                <w:bCs/>
-                <w:sz w:val="20"/>
-                <w:szCs w:val="24"/>
-              </w:rPr>
-            </w:pPr>
-            <w:r>
-              <w:rPr>
-                <w:rFonts w:ascii="맑은 고딕" w:eastAsia="맑은 고딕" w:hAnsi="맑은 고딕"/>
-                <w:bCs/>
-                <w:sz w:val="20"/>
-                <w:szCs w:val="24"/>
-              </w:rPr>
-              <w:t>$213K</w:t>
+            <w:r>
+              <w:t>$500</w:t>
             </w:r>
           </w:p>
         </w:tc>
@@ -14313,22 +14109,8 @@
             <w:tcW w:w="2126" w:type="dxa"/>
           </w:tcPr>
           <w:p>
-            <w:pPr>
-              <w:jc w:val="center"/>
-              <w:rPr>
-                <w:bCs/>
-                <w:sz w:val="20"/>
-                <w:szCs w:val="24"/>
-              </w:rPr>
-            </w:pPr>
-            <w:r>
-              <w:rPr>
-                <w:rFonts w:ascii="맑은 고딕" w:eastAsia="맑은 고딕" w:hAnsi="맑은 고딕"/>
-                <w:bCs/>
-                <w:sz w:val="20"/>
-                <w:szCs w:val="24"/>
-              </w:rPr>
-              <w:t>$563K</w:t>
+            <w:r>
+              <w:t>$1,000</w:t>
             </w:r>
           </w:p>
         </w:tc>
@@ -14337,22 +14119,8 @@
             <w:tcW w:w="3402" w:type="dxa"/>
           </w:tcPr>
           <w:p>
-            <w:pPr>
-              <w:jc w:val="center"/>
-              <w:rPr>
-                <w:bCs/>
-                <w:sz w:val="20"/>
-                <w:szCs w:val="24"/>
-              </w:rPr>
-            </w:pPr>
-            <w:r>
-              <w:rPr>
-                <w:rFonts w:ascii="맑은 고딕" w:eastAsia="맑은 고딕" w:hAnsi="맑은 고딕"/>
-                <w:bCs/>
-                <w:sz w:val="20"/>
-                <w:szCs w:val="24"/>
-              </w:rPr>
-              <w:t>$1,500K</w:t>
+            <w:r>
+              <w:t>$1,500</w:t>
             </w:r>
           </w:p>
         </w:tc>
@@ -14366,20 +14134,8 @@
             <w:tcW w:w="2836" w:type="dxa"/>
           </w:tcPr>
           <w:p>
-            <w:pPr>
-              <w:ind w:firstLineChars="100" w:firstLine="200"/>
-              <w:rPr>
-                <w:sz w:val="20"/>
-                <w:szCs w:val="24"/>
-              </w:rPr>
-            </w:pPr>
-            <w:r>
-              <w:rPr>
-                <w:rFonts w:ascii="맑은 고딕" w:eastAsia="맑은 고딕" w:hAnsi="맑은 고딕"/>
-                <w:sz w:val="20"/>
-                <w:szCs w:val="24"/>
-              </w:rPr>
-              <w:t>구독(월/연간)</w:t>
+            <w:r>
+              <w:t>매출액</w:t>
             </w:r>
           </w:p>
         </w:tc>
@@ -14388,22 +14144,8 @@
             <w:tcW w:w="2693" w:type="dxa"/>
           </w:tcPr>
           <w:p>
-            <w:pPr>
-              <w:jc w:val="center"/>
-              <w:rPr>
-                <w:bCs/>
-                <w:sz w:val="20"/>
-                <w:szCs w:val="24"/>
-              </w:rPr>
-            </w:pPr>
-            <w:r>
-              <w:rPr>
-                <w:rFonts w:ascii="맑은 고딕" w:eastAsia="맑은 고딕" w:hAnsi="맑은 고딕"/>
-                <w:bCs/>
-                <w:sz w:val="20"/>
-                <w:szCs w:val="24"/>
-              </w:rPr>
-              <w:t>$38K</w:t>
+            <w:r>
+              <w:t>$290K</w:t>
             </w:r>
           </w:p>
         </w:tc>
@@ -14412,22 +14154,8 @@
             <w:tcW w:w="2126" w:type="dxa"/>
           </w:tcPr>
           <w:p>
-            <w:pPr>
-              <w:jc w:val="center"/>
-              <w:rPr>
-                <w:bCs/>
-                <w:sz w:val="20"/>
-                <w:szCs w:val="24"/>
-              </w:rPr>
-            </w:pPr>
-            <w:r>
-              <w:rPr>
-                <w:rFonts w:ascii="맑은 고딕" w:eastAsia="맑은 고딕" w:hAnsi="맑은 고딕"/>
-                <w:bCs/>
-                <w:sz w:val="20"/>
-                <w:szCs w:val="24"/>
-              </w:rPr>
-              <w:t>$437K</w:t>
+            <w:r>
+              <w:t>$3,000K</w:t>
             </w:r>
           </w:p>
         </w:tc>
@@ -14436,22 +14164,8 @@
             <w:tcW w:w="3402" w:type="dxa"/>
           </w:tcPr>
           <w:p>
-            <w:pPr>
-              <w:jc w:val="center"/>
-              <w:rPr>
-                <w:bCs/>
-                <w:sz w:val="20"/>
-                <w:szCs w:val="24"/>
-              </w:rPr>
-            </w:pPr>
-            <w:r>
-              <w:rPr>
-                <w:rFonts w:ascii="맑은 고딕" w:eastAsia="맑은 고딕" w:hAnsi="맑은 고딕"/>
-                <w:bCs/>
-                <w:sz w:val="20"/>
-                <w:szCs w:val="24"/>
-              </w:rPr>
-              <w:t>$2,000K</w:t>
+            <w:r>
+              <w:t>$10,500K</w:t>
             </w:r>
           </w:p>
         </w:tc>
@@ -14465,20 +14179,10 @@
             <w:tcW w:w="2836" w:type="dxa"/>
           </w:tcPr>
           <w:p>
-            <w:pPr>
-              <w:ind w:firstLineChars="100" w:firstLine="200"/>
-              <w:rPr>
-                <w:sz w:val="20"/>
-                <w:szCs w:val="24"/>
-              </w:rPr>
-            </w:pPr>
-            <w:r>
-              <w:rPr>
-                <w:rFonts w:ascii="맑은 고딕" w:eastAsia="맑은 고딕" w:hAnsi="맑은 고딕"/>
-                <w:sz w:val="20"/>
-                <w:szCs w:val="24"/>
-              </w:rPr>
-              <w:t>엔터프라이즈</w:t>
+            <w:r>
+              <w:t>유료광고 /</w:t>
+              <w:br/>
+              <w:t>콘텐츠·오가닉·PLG 비중</w:t>
             </w:r>
           </w:p>
         </w:tc>
@@ -14487,22 +14191,8 @@
             <w:tcW w:w="2693" w:type="dxa"/>
           </w:tcPr>
           <w:p>
-            <w:pPr>
-              <w:jc w:val="center"/>
-              <w:rPr>
-                <w:bCs/>
-                <w:sz w:val="20"/>
-                <w:szCs w:val="24"/>
-              </w:rPr>
-            </w:pPr>
-            <w:r>
-              <w:rPr>
-                <w:rFonts w:ascii="맑은 고딕" w:eastAsia="맑은 고딕" w:hAnsi="맑은 고딕"/>
-                <w:bCs/>
-                <w:sz w:val="20"/>
-                <w:szCs w:val="24"/>
-              </w:rPr>
-              <w:t>—</w:t>
+            <w:r>
+              <w:t>85% / 15%</w:t>
             </w:r>
           </w:p>
         </w:tc>
@@ -14511,22 +14201,8 @@
             <w:tcW w:w="2126" w:type="dxa"/>
           </w:tcPr>
           <w:p>
-            <w:pPr>
-              <w:jc w:val="center"/>
-              <w:rPr>
-                <w:bCs/>
-                <w:sz w:val="20"/>
-                <w:szCs w:val="24"/>
-              </w:rPr>
-            </w:pPr>
-            <w:r>
-              <w:rPr>
-                <w:rFonts w:ascii="맑은 고딕" w:eastAsia="맑은 고딕" w:hAnsi="맑은 고딕"/>
-                <w:bCs/>
-                <w:sz w:val="20"/>
-                <w:szCs w:val="24"/>
-              </w:rPr>
-              <w:t>$250K</w:t>
+            <w:r>
+              <w:t>75% / 25%</w:t>
             </w:r>
           </w:p>
         </w:tc>
@@ -14535,22 +14211,8 @@
             <w:tcW w:w="3402" w:type="dxa"/>
           </w:tcPr>
           <w:p>
-            <w:pPr>
-              <w:jc w:val="center"/>
-              <w:rPr>
-                <w:bCs/>
-                <w:sz w:val="20"/>
-                <w:szCs w:val="24"/>
-              </w:rPr>
-            </w:pPr>
-            <w:r>
-              <w:rPr>
-                <w:rFonts w:ascii="맑은 고딕" w:eastAsia="맑은 고딕" w:hAnsi="맑은 고딕"/>
-                <w:bCs/>
-                <w:sz w:val="20"/>
-                <w:szCs w:val="24"/>
-              </w:rPr>
-              <w:t>$1,500K</w:t>
+            <w:r>
+              <w:t>70% / 30%</w:t>
             </w:r>
           </w:p>
         </w:tc>
@@ -14564,23 +14226,8 @@
             <w:tcW w:w="2836" w:type="dxa"/>
           </w:tcPr>
           <w:p>
-            <w:pPr>
-              <w:rPr>
-                <w:b/>
-                <w:bCs/>
-                <w:sz w:val="20"/>
-                <w:szCs w:val="24"/>
-              </w:rPr>
-            </w:pPr>
-            <w:r>
-              <w:rPr>
-                <w:rFonts w:ascii="맑은 고딕" w:eastAsia="맑은 고딕" w:hAnsi="맑은 고딕"/>
-                <w:b/>
-                <w:bCs/>
-                <w:sz w:val="20"/>
-                <w:szCs w:val="24"/>
-              </w:rPr>
-              <w:t>매출원가</w:t>
+            <w:r>
+              <w:t>마케팅비</w:t>
             </w:r>
           </w:p>
         </w:tc>
@@ -14589,22 +14236,8 @@
             <w:tcW w:w="2693" w:type="dxa"/>
           </w:tcPr>
           <w:p>
-            <w:pPr>
-              <w:jc w:val="center"/>
-              <w:rPr>
-                <w:bCs/>
-                <w:sz w:val="20"/>
-                <w:szCs w:val="24"/>
-              </w:rPr>
-            </w:pPr>
-            <w:r>
-              <w:rPr>
-                <w:rFonts w:ascii="맑은 고딕" w:eastAsia="맑은 고딕" w:hAnsi="맑은 고딕"/>
-                <w:bCs/>
-                <w:sz w:val="20"/>
-                <w:szCs w:val="24"/>
-              </w:rPr>
-              <w:t>-$58K (23%)</w:t>
+            <w:r>
+              <w:t>-$275K</w:t>
             </w:r>
           </w:p>
         </w:tc>
@@ -14613,22 +14246,8 @@
             <w:tcW w:w="2126" w:type="dxa"/>
           </w:tcPr>
           <w:p>
-            <w:pPr>
-              <w:jc w:val="center"/>
-              <w:rPr>
-                <w:bCs/>
-                <w:sz w:val="20"/>
-                <w:szCs w:val="24"/>
-              </w:rPr>
-            </w:pPr>
-            <w:r>
-              <w:rPr>
-                <w:rFonts w:ascii="맑은 고딕" w:eastAsia="맑은 고딕" w:hAnsi="맑은 고딕"/>
-                <w:bCs/>
-                <w:sz w:val="20"/>
-                <w:szCs w:val="24"/>
-              </w:rPr>
-              <w:t>-$263K (21%)</w:t>
+            <w:r>
+              <w:t>-$1,256K</w:t>
             </w:r>
           </w:p>
         </w:tc>
@@ -14637,22 +14256,8 @@
             <w:tcW w:w="3402" w:type="dxa"/>
           </w:tcPr>
           <w:p>
-            <w:pPr>
-              <w:jc w:val="center"/>
-              <w:rPr>
-                <w:bCs/>
-                <w:sz w:val="20"/>
-                <w:szCs w:val="24"/>
-              </w:rPr>
-            </w:pPr>
-            <w:r>
-              <w:rPr>
-                <w:rFonts w:ascii="맑은 고딕" w:eastAsia="맑은 고딕" w:hAnsi="맑은 고딕"/>
-                <w:bCs/>
-                <w:sz w:val="20"/>
-                <w:szCs w:val="24"/>
-              </w:rPr>
-              <w:t>-$900K (18%)</w:t>
+            <w:r>
+              <w:t>-$2,734K</w:t>
             </w:r>
           </w:p>
         </w:tc>
@@ -14663,29 +14268,8 @@
             <w:tcW w:w="2836" w:type="dxa"/>
           </w:tcPr>
           <w:p>
-            <w:pPr>
-              <w:rPr>
-                <w:sz w:val="20"/>
-                <w:szCs w:val="24"/>
-              </w:rPr>
-            </w:pPr>
-            <w:r>
-              <w:rPr>
-                <w:rFonts w:ascii="맑은 고딕" w:eastAsia="맑은 고딕" w:hAnsi="맑은 고딕"/>
-                <w:b/>
-                <w:sz w:val="20"/>
-                <w:szCs w:val="24"/>
-              </w:rPr>
-              <w:t>매</w:t>
-            </w:r>
-            <w:r>
-              <w:rPr>
-                <w:rFonts w:ascii="맑은 고딕" w:eastAsia="맑은 고딕" w:hAnsi="맑은 고딕" w:hint="eastAsia"/>
-                <w:b/>
-                <w:sz w:val="20"/>
-                <w:szCs w:val="24"/>
-              </w:rPr>
-              <w:t>출손익</w:t>
+            <w:r>
+              <w:t>매출원가</w:t>
             </w:r>
           </w:p>
         </w:tc>
@@ -14694,22 +14278,8 @@
             <w:tcW w:w="2693" w:type="dxa"/>
           </w:tcPr>
           <w:p>
-            <w:pPr>
-              <w:jc w:val="center"/>
-              <w:rPr>
-                <w:bCs/>
-                <w:sz w:val="20"/>
-                <w:szCs w:val="24"/>
-              </w:rPr>
-            </w:pPr>
-            <w:r>
-              <w:rPr>
-                <w:rFonts w:ascii="맑은 고딕" w:eastAsia="맑은 고딕" w:hAnsi="맑은 고딕"/>
-                <w:bCs/>
-                <w:sz w:val="20"/>
-                <w:szCs w:val="24"/>
-              </w:rPr>
-              <w:t>$193K (77%)</w:t>
+            <w:r>
+              <w:t>-$67K (23%)</w:t>
             </w:r>
           </w:p>
         </w:tc>
@@ -14718,22 +14288,8 @@
             <w:tcW w:w="2126" w:type="dxa"/>
           </w:tcPr>
           <w:p>
-            <w:pPr>
-              <w:jc w:val="center"/>
-              <w:rPr>
-                <w:bCs/>
-                <w:sz w:val="20"/>
-                <w:szCs w:val="24"/>
-              </w:rPr>
-            </w:pPr>
-            <w:r>
-              <w:rPr>
-                <w:rFonts w:ascii="맑은 고딕" w:eastAsia="맑은 고딕" w:hAnsi="맑은 고딕"/>
-                <w:bCs/>
-                <w:sz w:val="20"/>
-                <w:szCs w:val="24"/>
-              </w:rPr>
-              <w:t>$988K (79%)</w:t>
+            <w:r>
+              <w:t>-$630K (21%)</w:t>
             </w:r>
           </w:p>
         </w:tc>
@@ -14742,22 +14298,8 @@
             <w:tcW w:w="3402" w:type="dxa"/>
           </w:tcPr>
           <w:p>
-            <w:pPr>
-              <w:jc w:val="center"/>
-              <w:rPr>
-                <w:bCs/>
-                <w:sz w:val="20"/>
-                <w:szCs w:val="24"/>
-              </w:rPr>
-            </w:pPr>
-            <w:r>
-              <w:rPr>
-                <w:rFonts w:ascii="맑은 고딕" w:eastAsia="맑은 고딕" w:hAnsi="맑은 고딕"/>
-                <w:bCs/>
-                <w:sz w:val="20"/>
-                <w:szCs w:val="24"/>
-              </w:rPr>
-              <w:t>$4,100K (82%)</w:t>
+            <w:r>
+              <w:t>-$1,890K (18%)</w:t>
             </w:r>
           </w:p>
         </w:tc>
@@ -14768,31 +14310,8 @@
             <w:tcW w:w="2836" w:type="dxa"/>
           </w:tcPr>
           <w:p>
-            <w:pPr>
-              <w:rPr>
-                <w:b/>
-                <w:bCs/>
-                <w:sz w:val="20"/>
-                <w:szCs w:val="24"/>
-              </w:rPr>
-            </w:pPr>
-            <w:r>
-              <w:rPr>
-                <w:rFonts w:ascii="맑은 고딕" w:eastAsia="맑은 고딕" w:hAnsi="맑은 고딕"/>
-                <w:b/>
-                <w:bCs/>
-                <w:sz w:val="20"/>
-                <w:szCs w:val="24"/>
-              </w:rPr>
-              <w:t xml:space="preserve">판관비 </w:t>
-            </w:r>
-            <w:r>
-              <w:rPr>
-                <w:rFonts w:ascii="맑은 고딕" w:eastAsia="맑은 고딕" w:hAnsi="맑은 고딕"/>
-                <w:sz w:val="20"/>
-                <w:szCs w:val="24"/>
-              </w:rPr>
-              <w:t>(인건비+운영비)</w:t>
+            <w:r>
+              <w:t>매출손익</w:t>
             </w:r>
           </w:p>
         </w:tc>
@@ -14801,22 +14320,8 @@
             <w:tcW w:w="2693" w:type="dxa"/>
           </w:tcPr>
           <w:p>
-            <w:pPr>
-              <w:jc w:val="center"/>
-              <w:rPr>
-                <w:bCs/>
-                <w:sz w:val="20"/>
-                <w:szCs w:val="24"/>
-              </w:rPr>
-            </w:pPr>
-            <w:r>
-              <w:rPr>
-                <w:rFonts w:ascii="맑은 고딕" w:eastAsia="맑은 고딕" w:hAnsi="맑은 고딕"/>
-                <w:bCs/>
-                <w:sz w:val="20"/>
-                <w:szCs w:val="24"/>
-              </w:rPr>
-              <w:t>-$184K</w:t>
+            <w:r>
+              <w:t>$223K (77%)</w:t>
             </w:r>
           </w:p>
         </w:tc>
@@ -14825,22 +14330,8 @@
             <w:tcW w:w="2126" w:type="dxa"/>
           </w:tcPr>
           <w:p>
-            <w:pPr>
-              <w:jc w:val="center"/>
-              <w:rPr>
-                <w:bCs/>
-                <w:sz w:val="20"/>
-                <w:szCs w:val="24"/>
-              </w:rPr>
-            </w:pPr>
-            <w:r>
-              <w:rPr>
-                <w:rFonts w:ascii="맑은 고딕" w:eastAsia="맑은 고딕" w:hAnsi="맑은 고딕"/>
-                <w:bCs/>
-                <w:sz w:val="20"/>
-                <w:szCs w:val="24"/>
-              </w:rPr>
-              <w:t>-$1,099K</w:t>
+            <w:r>
+              <w:t>$2,370K (79%)</w:t>
             </w:r>
           </w:p>
         </w:tc>
@@ -14849,22 +14340,8 @@
             <w:tcW w:w="3402" w:type="dxa"/>
           </w:tcPr>
           <w:p>
-            <w:pPr>
-              <w:jc w:val="center"/>
-              <w:rPr>
-                <w:bCs/>
-                <w:sz w:val="20"/>
-                <w:szCs w:val="24"/>
-              </w:rPr>
-            </w:pPr>
-            <w:r>
-              <w:rPr>
-                <w:rFonts w:ascii="맑은 고딕" w:eastAsia="맑은 고딕" w:hAnsi="맑은 고딕"/>
-                <w:bCs/>
-                <w:sz w:val="20"/>
-                <w:szCs w:val="24"/>
-              </w:rPr>
-              <w:t>-$1,884K</w:t>
+            <w:r>
+              <w:t>$8,610K (82%)</w:t>
             </w:r>
           </w:p>
         </w:tc>
@@ -14875,20 +14352,8 @@
             <w:tcW w:w="2836" w:type="dxa"/>
           </w:tcPr>
           <w:p>
-            <w:pPr>
-              <w:rPr>
-                <w:sz w:val="20"/>
-                <w:szCs w:val="24"/>
-              </w:rPr>
-            </w:pPr>
-            <w:r>
-              <w:rPr>
-                <w:rFonts w:ascii="맑은 고딕" w:eastAsia="맑은 고딕" w:hAnsi="맑은 고딕" w:hint="eastAsia"/>
-                <w:b/>
-                <w:sz w:val="20"/>
-                <w:szCs w:val="24"/>
-              </w:rPr>
-              <w:t>영업이익</w:t>
+            <w:r>
+              <w:t>판관비 합계</w:t>
             </w:r>
           </w:p>
         </w:tc>
@@ -14897,22 +14362,8 @@
             <w:tcW w:w="2693" w:type="dxa"/>
           </w:tcPr>
           <w:p>
-            <w:pPr>
-              <w:jc w:val="center"/>
-              <w:rPr>
-                <w:bCs/>
-                <w:sz w:val="20"/>
-                <w:szCs w:val="24"/>
-              </w:rPr>
-            </w:pPr>
-            <w:r>
-              <w:rPr>
-                <w:rFonts w:ascii="맑은 고딕" w:eastAsia="맑은 고딕" w:hAnsi="맑은 고딕"/>
-                <w:bCs/>
-                <w:sz w:val="20"/>
-                <w:szCs w:val="24"/>
-              </w:rPr>
-              <w:t>+$9K</w:t>
+            <w:r>
+              <w:t>-$459K</w:t>
             </w:r>
           </w:p>
         </w:tc>
@@ -14921,22 +14372,8 @@
             <w:tcW w:w="2126" w:type="dxa"/>
           </w:tcPr>
           <w:p>
-            <w:pPr>
-              <w:jc w:val="center"/>
-              <w:rPr>
-                <w:bCs/>
-                <w:sz w:val="20"/>
-                <w:szCs w:val="24"/>
-              </w:rPr>
-            </w:pPr>
-            <w:r>
-              <w:rPr>
-                <w:rFonts w:ascii="맑은 고딕" w:eastAsia="맑은 고딕" w:hAnsi="맑은 고딕"/>
-                <w:bCs/>
-                <w:sz w:val="20"/>
-                <w:szCs w:val="24"/>
-              </w:rPr>
-              <w:t>-$112K</w:t>
+            <w:r>
+              <w:t>-$2,355K</w:t>
             </w:r>
           </w:p>
         </w:tc>
@@ -14945,22 +14382,8 @@
             <w:tcW w:w="3402" w:type="dxa"/>
           </w:tcPr>
           <w:p>
-            <w:pPr>
-              <w:jc w:val="center"/>
-              <w:rPr>
-                <w:bCs/>
-                <w:sz w:val="20"/>
-                <w:szCs w:val="24"/>
-              </w:rPr>
-            </w:pPr>
-            <w:r>
-              <w:rPr>
-                <w:rFonts w:ascii="맑은 고딕" w:eastAsia="맑은 고딕" w:hAnsi="맑은 고딕"/>
-                <w:bCs/>
-                <w:sz w:val="20"/>
-                <w:szCs w:val="24"/>
-              </w:rPr>
-              <w:t>+$2,216K</w:t>
+            <w:r>
+              <w:t>-$6,510K</w:t>
             </w:r>
           </w:p>
         </w:tc>
@@ -14971,92 +14394,80 @@
             <w:tcW w:w="2836" w:type="dxa"/>
           </w:tcPr>
           <w:p>
-            <w:pPr>
-              <w:rPr>
-                <w:sz w:val="20"/>
-                <w:szCs w:val="24"/>
-              </w:rPr>
-            </w:pPr>
-            <w:r>
-              <w:rPr>
-                <w:rFonts w:ascii="맑은 고딕" w:eastAsia="맑은 고딕" w:hAnsi="맑은 고딕"/>
-                <w:b/>
-                <w:sz w:val="20"/>
-                <w:szCs w:val="24"/>
-              </w:rPr>
+            <w:r>
+              <w:t>영업이익</w:t>
+            </w:r>
+          </w:p>
+        </w:tc>
+        <w:tc>
+          <w:tcPr>
+            <w:tcW w:w="2693" w:type="dxa"/>
+          </w:tcPr>
+          <w:p>
+            <w:r>
+              <w:t>-$236K</w:t>
+            </w:r>
+          </w:p>
+        </w:tc>
+        <w:tc>
+          <w:tcPr>
+            <w:tcW w:w="2126" w:type="dxa"/>
+          </w:tcPr>
+          <w:p>
+            <w:r>
+              <w:t>$15K</w:t>
+            </w:r>
+          </w:p>
+        </w:tc>
+        <w:tc>
+          <w:tcPr>
+            <w:tcW w:w="3402" w:type="dxa"/>
+          </w:tcPr>
+          <w:p>
+            <w:r>
+              <w:t>$2,100K</w:t>
+            </w:r>
+          </w:p>
+        </w:tc>
+      </w:tr>
+      <w:tr>
+        <w:tc>
+          <w:tcPr>
+            <w:tcW w:type="dxa" w:w="2836"/>
+          </w:tcPr>
+          <w:p>
+            <w:r>
               <w:t>영업이익률</w:t>
             </w:r>
           </w:p>
         </w:tc>
         <w:tc>
           <w:tcPr>
-            <w:tcW w:w="2693" w:type="dxa"/>
-          </w:tcPr>
-          <w:p>
-            <w:pPr>
-              <w:jc w:val="center"/>
-              <w:rPr>
-                <w:bCs/>
-                <w:sz w:val="20"/>
-                <w:szCs w:val="24"/>
-              </w:rPr>
-            </w:pPr>
-            <w:r>
-              <w:rPr>
-                <w:rFonts w:ascii="맑은 고딕" w:eastAsia="맑은 고딕" w:hAnsi="맑은 고딕"/>
-                <w:bCs/>
-                <w:sz w:val="20"/>
-                <w:szCs w:val="24"/>
-              </w:rPr>
-              <w:t>+3%</w:t>
-            </w:r>
-          </w:p>
-        </w:tc>
-        <w:tc>
-          <w:tcPr>
-            <w:tcW w:w="2126" w:type="dxa"/>
-          </w:tcPr>
-          <w:p>
-            <w:pPr>
-              <w:jc w:val="center"/>
-              <w:rPr>
-                <w:bCs/>
-                <w:sz w:val="20"/>
-                <w:szCs w:val="24"/>
-              </w:rPr>
-            </w:pPr>
-            <w:r>
-              <w:rPr>
-                <w:rFonts w:ascii="맑은 고딕" w:eastAsia="맑은 고딕" w:hAnsi="맑은 고딕"/>
-                <w:bCs/>
-                <w:sz w:val="20"/>
-                <w:szCs w:val="24"/>
-              </w:rPr>
-              <w:t>-9%</w:t>
-            </w:r>
-          </w:p>
-        </w:tc>
-        <w:tc>
-          <w:tcPr>
-            <w:tcW w:w="3402" w:type="dxa"/>
-          </w:tcPr>
-          <w:p>
-            <w:pPr>
-              <w:jc w:val="center"/>
-              <w:rPr>
-                <w:bCs/>
-                <w:sz w:val="20"/>
-                <w:szCs w:val="24"/>
-              </w:rPr>
-            </w:pPr>
-            <w:r>
-              <w:rPr>
-                <w:rFonts w:ascii="맑은 고딕" w:eastAsia="맑은 고딕" w:hAnsi="맑은 고딕"/>
-                <w:bCs/>
-                <w:sz w:val="20"/>
-                <w:szCs w:val="24"/>
-              </w:rPr>
-              <w:t>+44%</w:t>
+            <w:tcW w:type="dxa" w:w="2693"/>
+          </w:tcPr>
+          <w:p>
+            <w:r>
+              <w:t>-81%</w:t>
+            </w:r>
+          </w:p>
+        </w:tc>
+        <w:tc>
+          <w:tcPr>
+            <w:tcW w:type="dxa" w:w="2126"/>
+          </w:tcPr>
+          <w:p>
+            <w:r>
+              <w:t>0.5%</w:t>
+            </w:r>
+          </w:p>
+        </w:tc>
+        <w:tc>
+          <w:tcPr>
+            <w:tcW w:type="dxa" w:w="3402"/>
+          </w:tcPr>
+          <w:p>
+            <w:r>
+              <w:t>20%</w:t>
             </w:r>
           </w:p>
         </w:tc>
@@ -15117,27 +14528,7 @@
             <w:shd w:val="clear" w:color="auto" w:fill="F2F2F2" w:themeFill="background1" w:themeFillShade="F2"/>
           </w:tcPr>
           <w:p>
-            <w:pPr>
-              <w:pStyle w:val="TableParagraph"/>
-              <w:spacing w:line="348" w:lineRule="exact"/>
-              <w:ind w:left="82" w:right="73"/>
-              <w:jc w:val="center"/>
-              <w:rPr>
-                <w:rFonts w:asciiTheme="minorEastAsia" w:eastAsiaTheme="minorEastAsia" w:hAnsiTheme="minorEastAsia"/>
-                <w:b/>
-                <w:sz w:val="20"/>
-                <w:szCs w:val="20"/>
-              </w:rPr>
-            </w:pPr>
-            <w:r>
-              <w:rPr>
-                <w:rFonts w:asciiTheme="minorEastAsia" w:eastAsiaTheme="minorEastAsia" w:hAnsiTheme="minorEastAsia"/>
-                <w:b/>
-                <w:spacing w:val="-5"/>
-                <w:w w:val="105"/>
-                <w:sz w:val="20"/>
-                <w:szCs w:val="20"/>
-              </w:rPr>
+            <w:r>
               <w:t>구분</w:t>
             </w:r>
           </w:p>
@@ -15151,49 +14542,8 @@
             <w:shd w:val="clear" w:color="auto" w:fill="F2F2F2" w:themeFill="background1" w:themeFillShade="F2"/>
           </w:tcPr>
           <w:p>
-            <w:pPr>
-              <w:pStyle w:val="TableParagraph"/>
-              <w:spacing w:line="348" w:lineRule="exact"/>
-              <w:ind w:left="238" w:right="227"/>
-              <w:jc w:val="center"/>
-              <w:rPr>
-                <w:rFonts w:asciiTheme="minorEastAsia" w:eastAsiaTheme="minorEastAsia" w:hAnsiTheme="minorEastAsia"/>
-                <w:b/>
-                <w:sz w:val="20"/>
-                <w:szCs w:val="20"/>
-              </w:rPr>
-            </w:pPr>
-            <w:r>
-              <w:rPr>
-                <w:rFonts w:asciiTheme="minorEastAsia" w:eastAsiaTheme="minorEastAsia" w:hAnsiTheme="minorEastAsia"/>
-                <w:b/>
-                <w:w w:val="105"/>
-                <w:sz w:val="20"/>
-                <w:szCs w:val="20"/>
-              </w:rPr>
-              <w:t>추진</w:t>
-            </w:r>
-            <w:r>
-              <w:rPr>
-                <w:rFonts w:asciiTheme="minorEastAsia" w:eastAsiaTheme="minorEastAsia" w:hAnsiTheme="minorEastAsia"/>
-                <w:b/>
-                <w:spacing w:val="30"/>
-                <w:w w:val="105"/>
-                <w:sz w:val="20"/>
-                <w:szCs w:val="20"/>
-              </w:rPr>
-              <w:t xml:space="preserve"> </w:t>
-            </w:r>
-            <w:r>
-              <w:rPr>
-                <w:rFonts w:asciiTheme="minorEastAsia" w:eastAsiaTheme="minorEastAsia" w:hAnsiTheme="minorEastAsia"/>
-                <w:b/>
-                <w:spacing w:val="-5"/>
-                <w:w w:val="105"/>
-                <w:sz w:val="20"/>
-                <w:szCs w:val="20"/>
-              </w:rPr>
-              <w:t>내용</w:t>
+            <w:r>
+              <w:t>추진 내용</w:t>
             </w:r>
           </w:p>
         </w:tc>
@@ -15206,49 +14556,8 @@
             <w:shd w:val="clear" w:color="auto" w:fill="F2F2F2" w:themeFill="background1" w:themeFillShade="F2"/>
           </w:tcPr>
           <w:p>
-            <w:pPr>
-              <w:pStyle w:val="TableParagraph"/>
-              <w:spacing w:line="348" w:lineRule="exact"/>
-              <w:ind w:left="536" w:right="520"/>
-              <w:jc w:val="center"/>
-              <w:rPr>
-                <w:rFonts w:asciiTheme="minorEastAsia" w:eastAsiaTheme="minorEastAsia" w:hAnsiTheme="minorEastAsia"/>
-                <w:b/>
-                <w:sz w:val="20"/>
-                <w:szCs w:val="20"/>
-              </w:rPr>
-            </w:pPr>
-            <w:r>
-              <w:rPr>
-                <w:rFonts w:asciiTheme="minorEastAsia" w:eastAsiaTheme="minorEastAsia" w:hAnsiTheme="minorEastAsia"/>
-                <w:b/>
-                <w:w w:val="105"/>
-                <w:sz w:val="20"/>
-                <w:szCs w:val="20"/>
-              </w:rPr>
-              <w:t>추진</w:t>
-            </w:r>
-            <w:r>
-              <w:rPr>
-                <w:rFonts w:asciiTheme="minorEastAsia" w:eastAsiaTheme="minorEastAsia" w:hAnsiTheme="minorEastAsia"/>
-                <w:b/>
-                <w:spacing w:val="30"/>
-                <w:w w:val="105"/>
-                <w:sz w:val="20"/>
-                <w:szCs w:val="20"/>
-              </w:rPr>
-              <w:t xml:space="preserve"> </w:t>
-            </w:r>
-            <w:r>
-              <w:rPr>
-                <w:rFonts w:asciiTheme="minorEastAsia" w:eastAsiaTheme="minorEastAsia" w:hAnsiTheme="minorEastAsia"/>
-                <w:b/>
-                <w:spacing w:val="-5"/>
-                <w:w w:val="105"/>
-                <w:sz w:val="20"/>
-                <w:szCs w:val="20"/>
-              </w:rPr>
-              <w:t>기간</w:t>
+            <w:r>
+              <w:t>추진 기간</w:t>
             </w:r>
           </w:p>
         </w:tc>
@@ -15261,49 +14570,8 @@
             <w:shd w:val="clear" w:color="auto" w:fill="F2F2F2" w:themeFill="background1" w:themeFillShade="F2"/>
           </w:tcPr>
           <w:p>
-            <w:pPr>
-              <w:pStyle w:val="TableParagraph"/>
-              <w:spacing w:line="348" w:lineRule="exact"/>
-              <w:ind w:left="290" w:right="270"/>
-              <w:jc w:val="center"/>
-              <w:rPr>
-                <w:rFonts w:asciiTheme="minorEastAsia" w:eastAsiaTheme="minorEastAsia" w:hAnsiTheme="minorEastAsia"/>
-                <w:b/>
-                <w:sz w:val="20"/>
-                <w:szCs w:val="20"/>
-              </w:rPr>
-            </w:pPr>
-            <w:r>
-              <w:rPr>
-                <w:rFonts w:asciiTheme="minorEastAsia" w:eastAsiaTheme="minorEastAsia" w:hAnsiTheme="minorEastAsia"/>
-                <w:b/>
-                <w:w w:val="105"/>
-                <w:sz w:val="20"/>
-                <w:szCs w:val="20"/>
-              </w:rPr>
-              <w:t>세부</w:t>
-            </w:r>
-            <w:r>
-              <w:rPr>
-                <w:rFonts w:asciiTheme="minorEastAsia" w:eastAsiaTheme="minorEastAsia" w:hAnsiTheme="minorEastAsia"/>
-                <w:b/>
-                <w:spacing w:val="30"/>
-                <w:w w:val="105"/>
-                <w:sz w:val="20"/>
-                <w:szCs w:val="20"/>
-              </w:rPr>
-              <w:t xml:space="preserve"> </w:t>
-            </w:r>
-            <w:r>
-              <w:rPr>
-                <w:rFonts w:asciiTheme="minorEastAsia" w:eastAsiaTheme="minorEastAsia" w:hAnsiTheme="minorEastAsia"/>
-                <w:b/>
-                <w:spacing w:val="-5"/>
-                <w:w w:val="105"/>
-                <w:sz w:val="20"/>
-                <w:szCs w:val="20"/>
-              </w:rPr>
-              <w:t>내용</w:t>
+            <w:r>
+              <w:t>세부 내용</w:t>
             </w:r>
           </w:p>
         </w:tc>
@@ -15320,19 +14588,7 @@
             </w:tcBorders>
           </w:tcPr>
           <w:p>
-            <w:pPr>
-              <w:jc w:val="center"/>
-              <w:rPr>
-                <w:sz w:val="20"/>
-                <w:szCs w:val="20"/>
-              </w:rPr>
-            </w:pPr>
-            <w:r>
-              <w:rPr>
-                <w:rFonts w:ascii="맑은 고딕" w:eastAsia="맑은 고딕" w:hAnsi="맑은 고딕"/>
-                <w:sz w:val="20"/>
-                <w:szCs w:val="20"/>
-              </w:rPr>
+            <w:r>
               <w:t>1</w:t>
             </w:r>
           </w:p>
@@ -15348,19 +14604,8 @@
             </w:tcMar>
           </w:tcPr>
           <w:p>
-            <w:pPr>
-              <w:rPr>
-                <w:sz w:val="20"/>
-                <w:szCs w:val="20"/>
-              </w:rPr>
-            </w:pPr>
-            <w:r>
-              <w:rPr>
-                <w:rFonts w:ascii="맑은 고딕" w:eastAsia="맑은 고딕" w:hAnsi="맑은 고딕"/>
-                <w:sz w:val="20"/>
-                <w:szCs w:val="20"/>
-              </w:rPr>
-              <w:t>글로벌 확장</w:t>
+            <w:r>
+              <w:t>예창패 기반 제품화</w:t>
             </w:r>
           </w:p>
         </w:tc>
@@ -15372,20 +14617,8 @@
             </w:tcBorders>
           </w:tcPr>
           <w:p>
-            <w:pPr>
-              <w:jc w:val="center"/>
-              <w:rPr>
-                <w:sz w:val="20"/>
-                <w:szCs w:val="20"/>
-              </w:rPr>
-            </w:pPr>
-            <w:r>
-              <w:rPr>
-                <w:rFonts w:ascii="맑은 고딕" w:eastAsia="맑은 고딕" w:hAnsi="맑은 고딕"/>
-                <w:sz w:val="20"/>
-                <w:szCs w:val="20"/>
-              </w:rPr>
-              <w:t>27년 상반기</w:t>
+            <w:r>
+              <w:t>26년 하반기</w:t>
             </w:r>
           </w:p>
         </w:tc>
@@ -15400,19 +14633,8 @@
             </w:tcMar>
           </w:tcPr>
           <w:p>
-            <w:pPr>
-              <w:rPr>
-                <w:sz w:val="20"/>
-                <w:szCs w:val="20"/>
-              </w:rPr>
-            </w:pPr>
-            <w:r>
-              <w:rPr>
-                <w:rFonts w:ascii="맑은 고딕" w:eastAsia="맑은 고딕" w:hAnsi="맑은 고딕"/>
-                <w:sz w:val="20"/>
-                <w:szCs w:val="20"/>
-              </w:rPr>
-              <w:t>글로벌 PLG로 해외 고객 기반 확대</w:t>
+            <w:r>
+              <w:t>핵심 엔진 고도화, 웹서비스 제품화, 베타 오픈 준비</w:t>
             </w:r>
           </w:p>
         </w:tc>
@@ -15426,19 +14648,7 @@
             <w:tcW w:w="709" w:type="dxa"/>
           </w:tcPr>
           <w:p>
-            <w:pPr>
-              <w:jc w:val="center"/>
-              <w:rPr>
-                <w:sz w:val="20"/>
-                <w:szCs w:val="20"/>
-              </w:rPr>
-            </w:pPr>
-            <w:r>
-              <w:rPr>
-                <w:rFonts w:ascii="맑은 고딕" w:eastAsia="맑은 고딕" w:hAnsi="맑은 고딕"/>
-                <w:sz w:val="20"/>
-                <w:szCs w:val="20"/>
-              </w:rPr>
+            <w:r>
               <w:t>2</w:t>
             </w:r>
           </w:p>
@@ -15451,29 +14661,8 @@
             </w:tcMar>
           </w:tcPr>
           <w:p>
-            <w:pPr>
-              <w:rPr>
-                <w:sz w:val="20"/>
-                <w:szCs w:val="20"/>
-              </w:rPr>
-            </w:pPr>
-            <w:proofErr w:type="spellStart"/>
-            <w:r>
-              <w:rPr>
-                <w:rFonts w:ascii="맑은 고딕" w:eastAsia="맑은 고딕" w:hAnsi="맑은 고딕"/>
-                <w:sz w:val="20"/>
-                <w:szCs w:val="20"/>
-              </w:rPr>
-              <w:t>초창패</w:t>
-            </w:r>
-            <w:proofErr w:type="spellEnd"/>
-            <w:r>
-              <w:rPr>
-                <w:rFonts w:ascii="맑은 고딕" w:eastAsia="맑은 고딕" w:hAnsi="맑은 고딕"/>
-                <w:sz w:val="20"/>
-                <w:szCs w:val="20"/>
-              </w:rPr>
-              <w:t xml:space="preserve"> 기반 운영</w:t>
+            <w:r>
+              <w:t>TIPS 기반 초기 판매 확대</w:t>
             </w:r>
           </w:p>
         </w:tc>
@@ -15482,20 +14671,8 @@
             <w:tcW w:w="2409" w:type="dxa"/>
           </w:tcPr>
           <w:p>
-            <w:pPr>
-              <w:jc w:val="center"/>
-              <w:rPr>
-                <w:sz w:val="20"/>
-                <w:szCs w:val="20"/>
-              </w:rPr>
-            </w:pPr>
-            <w:r>
-              <w:rPr>
-                <w:rFonts w:ascii="맑은 고딕" w:eastAsia="맑은 고딕" w:hAnsi="맑은 고딕"/>
-                <w:sz w:val="20"/>
-                <w:szCs w:val="20"/>
-              </w:rPr>
-              <w:t>27년 하반기</w:t>
+            <w:r>
+              <w:t>27년 상반기</w:t>
             </w:r>
           </w:p>
         </w:tc>
@@ -15507,37 +14684,8 @@
             </w:tcMar>
           </w:tcPr>
           <w:p>
-            <w:pPr>
-              <w:rPr>
-                <w:sz w:val="20"/>
-                <w:szCs w:val="20"/>
-              </w:rPr>
-            </w:pPr>
-            <w:r>
-              <w:rPr>
-                <w:rFonts w:ascii="맑은 고딕" w:eastAsia="맑은 고딕" w:hAnsi="맑은 고딕"/>
-                <w:sz w:val="20"/>
-                <w:szCs w:val="20"/>
-              </w:rPr>
-              <w:t xml:space="preserve">4명 유지, </w:t>
-            </w:r>
-            <w:proofErr w:type="spellStart"/>
-            <w:r>
-              <w:rPr>
-                <w:rFonts w:ascii="맑은 고딕" w:eastAsia="맑은 고딕" w:hAnsi="맑은 고딕"/>
-                <w:sz w:val="20"/>
-                <w:szCs w:val="20"/>
-              </w:rPr>
-              <w:t>초창패</w:t>
-            </w:r>
-            <w:proofErr w:type="spellEnd"/>
-            <w:r>
-              <w:rPr>
-                <w:rFonts w:ascii="맑은 고딕" w:eastAsia="맑은 고딕" w:hAnsi="맑은 고딕"/>
-                <w:sz w:val="20"/>
-                <w:szCs w:val="20"/>
-              </w:rPr>
-              <w:t xml:space="preserve"> 기반 운영</w:t>
+            <w:r>
+              <w:t>온라인 광고 본격 집행, 글로벌 PLG 초기 유입 확보, 580건 판매 목표</w:t>
             </w:r>
           </w:p>
         </w:tc>
@@ -15551,19 +14699,7 @@
             <w:tcW w:w="709" w:type="dxa"/>
           </w:tcPr>
           <w:p>
-            <w:pPr>
-              <w:jc w:val="center"/>
-              <w:rPr>
-                <w:sz w:val="20"/>
-                <w:szCs w:val="20"/>
-              </w:rPr>
-            </w:pPr>
-            <w:r>
-              <w:rPr>
-                <w:rFonts w:ascii="맑은 고딕" w:eastAsia="맑은 고딕" w:hAnsi="맑은 고딕"/>
-                <w:sz w:val="20"/>
-                <w:szCs w:val="20"/>
-              </w:rPr>
+            <w:r>
               <w:t>3</w:t>
             </w:r>
           </w:p>
@@ -15576,19 +14712,8 @@
             </w:tcMar>
           </w:tcPr>
           <w:p>
-            <w:pPr>
-              <w:rPr>
-                <w:sz w:val="20"/>
-                <w:szCs w:val="20"/>
-              </w:rPr>
-            </w:pPr>
-            <w:r>
-              <w:rPr>
-                <w:rFonts w:ascii="맑은 고딕" w:eastAsia="맑은 고딕" w:hAnsi="맑은 고딕"/>
-                <w:sz w:val="20"/>
-                <w:szCs w:val="20"/>
-              </w:rPr>
-              <w:t>투자유치 및 구독 출시</w:t>
+            <w:r>
+              <w:t>손익분기 통과 및 구독 고도화</w:t>
             </w:r>
           </w:p>
         </w:tc>
@@ -15597,19 +14722,7 @@
             <w:tcW w:w="2409" w:type="dxa"/>
           </w:tcPr>
           <w:p>
-            <w:pPr>
-              <w:jc w:val="center"/>
-              <w:rPr>
-                <w:sz w:val="20"/>
-                <w:szCs w:val="20"/>
-              </w:rPr>
-            </w:pPr>
-            <w:r>
-              <w:rPr>
-                <w:rFonts w:ascii="맑은 고딕" w:eastAsia="맑은 고딕" w:hAnsi="맑은 고딕"/>
-                <w:sz w:val="20"/>
-                <w:szCs w:val="20"/>
-              </w:rPr>
+            <w:r>
               <w:t>28년 상반기</w:t>
             </w:r>
           </w:p>
@@ -15622,19 +14735,8 @@
             </w:tcMar>
           </w:tcPr>
           <w:p>
-            <w:pPr>
-              <w:rPr>
-                <w:sz w:val="20"/>
-                <w:szCs w:val="20"/>
-              </w:rPr>
-            </w:pPr>
-            <w:r>
-              <w:rPr>
-                <w:rFonts w:ascii="맑은 고딕" w:eastAsia="맑은 고딕" w:hAnsi="맑은 고딕"/>
-                <w:sz w:val="20"/>
-                <w:szCs w:val="20"/>
-              </w:rPr>
-              <w:t>6명(+엔지니어, +마케팅/AM). TIPS 투자 유치, 구독 모델 출시</w:t>
+            <w:r>
+              <w:t>구독 전환 구조 고도화, 콘텐츠·오가닉·PLG 확대, 손익분기 수준 흑자 전환</w:t>
             </w:r>
           </w:p>
         </w:tc>
@@ -15648,19 +14750,7 @@
             <w:tcW w:w="709" w:type="dxa"/>
           </w:tcPr>
           <w:p>
-            <w:pPr>
-              <w:jc w:val="center"/>
-              <w:rPr>
-                <w:sz w:val="20"/>
-                <w:szCs w:val="20"/>
-              </w:rPr>
-            </w:pPr>
-            <w:r>
-              <w:rPr>
-                <w:rFonts w:ascii="맑은 고딕" w:eastAsia="맑은 고딕" w:hAnsi="맑은 고딕"/>
-                <w:sz w:val="20"/>
-                <w:szCs w:val="20"/>
-              </w:rPr>
+            <w:r>
               <w:t>4</w:t>
             </w:r>
           </w:p>
@@ -15673,18 +14763,7 @@
             </w:tcMar>
           </w:tcPr>
           <w:p>
-            <w:pPr>
-              <w:rPr>
-                <w:sz w:val="20"/>
-                <w:szCs w:val="20"/>
-              </w:rPr>
-            </w:pPr>
-            <w:r>
-              <w:rPr>
-                <w:rFonts w:ascii="맑은 고딕" w:eastAsia="맑은 고딕" w:hAnsi="맑은 고딕"/>
-                <w:sz w:val="20"/>
-                <w:szCs w:val="20"/>
-              </w:rPr>
+            <w:r>
               <w:t>엔터프라이즈 본격화 및 팀 확장</w:t>
             </w:r>
           </w:p>
@@ -15694,19 +14773,7 @@
             <w:tcW w:w="2409" w:type="dxa"/>
           </w:tcPr>
           <w:p>
-            <w:pPr>
-              <w:jc w:val="center"/>
-              <w:rPr>
-                <w:sz w:val="20"/>
-                <w:szCs w:val="20"/>
-              </w:rPr>
-            </w:pPr>
-            <w:r>
-              <w:rPr>
-                <w:rFonts w:ascii="맑은 고딕" w:eastAsia="맑은 고딕" w:hAnsi="맑은 고딕"/>
-                <w:sz w:val="20"/>
-                <w:szCs w:val="20"/>
-              </w:rPr>
+            <w:r>
               <w:t>28년 하반기</w:t>
             </w:r>
           </w:p>
@@ -15719,18 +14786,7 @@
             </w:tcMar>
           </w:tcPr>
           <w:p>
-            <w:pPr>
-              <w:rPr>
-                <w:sz w:val="20"/>
-                <w:szCs w:val="20"/>
-              </w:rPr>
-            </w:pPr>
-            <w:r>
-              <w:rPr>
-                <w:rFonts w:ascii="맑은 고딕" w:eastAsia="맑은 고딕" w:hAnsi="맑은 고딕"/>
-                <w:sz w:val="20"/>
-                <w:szCs w:val="20"/>
-              </w:rPr>
+            <w:r>
               <w:t>8명(+엔지니어, +AM). 엔터프라이즈 파일럿, 기업 고객 계약 확대</w:t>
             </w:r>
           </w:p>
@@ -15745,19 +14801,7 @@
             <w:tcW w:w="709" w:type="dxa"/>
           </w:tcPr>
           <w:p>
-            <w:pPr>
-              <w:jc w:val="center"/>
-              <w:rPr>
-                <w:sz w:val="20"/>
-                <w:szCs w:val="20"/>
-              </w:rPr>
-            </w:pPr>
-            <w:r>
-              <w:rPr>
-                <w:rFonts w:ascii="맑은 고딕" w:eastAsia="맑은 고딕" w:hAnsi="맑은 고딕"/>
-                <w:sz w:val="20"/>
-                <w:szCs w:val="20"/>
-              </w:rPr>
+            <w:r>
               <w:t>5</w:t>
             </w:r>
           </w:p>
@@ -15770,18 +14814,7 @@
             </w:tcMar>
           </w:tcPr>
           <w:p>
-            <w:pPr>
-              <w:rPr>
-                <w:sz w:val="20"/>
-                <w:szCs w:val="20"/>
-              </w:rPr>
-            </w:pPr>
-            <w:r>
-              <w:rPr>
-                <w:rFonts w:ascii="맑은 고딕" w:eastAsia="맑은 고딕" w:hAnsi="맑은 고딕"/>
-                <w:sz w:val="20"/>
-                <w:szCs w:val="20"/>
-              </w:rPr>
+            <w:r>
               <w:t>글로벌 확장 가속</w:t>
             </w:r>
           </w:p>
@@ -15791,19 +14824,7 @@
             <w:tcW w:w="2409" w:type="dxa"/>
           </w:tcPr>
           <w:p>
-            <w:pPr>
-              <w:jc w:val="center"/>
-              <w:rPr>
-                <w:sz w:val="20"/>
-                <w:szCs w:val="20"/>
-              </w:rPr>
-            </w:pPr>
-            <w:r>
-              <w:rPr>
-                <w:rFonts w:ascii="맑은 고딕" w:eastAsia="맑은 고딕" w:hAnsi="맑은 고딕"/>
-                <w:sz w:val="20"/>
-                <w:szCs w:val="20"/>
-              </w:rPr>
+            <w:r>
               <w:t>29년</w:t>
             </w:r>
           </w:p>
@@ -15816,19 +14837,8 @@
             </w:tcMar>
           </w:tcPr>
           <w:p>
-            <w:pPr>
-              <w:rPr>
-                <w:sz w:val="20"/>
-                <w:szCs w:val="20"/>
-              </w:rPr>
-            </w:pPr>
-            <w:r>
-              <w:rPr>
-                <w:rFonts w:ascii="맑은 고딕" w:eastAsia="맑은 고딕" w:hAnsi="맑은 고딕"/>
-                <w:sz w:val="20"/>
-                <w:szCs w:val="20"/>
-              </w:rPr>
-              <w:t>12명으로 확장(+데이터, +세일즈, +AM, +엔지니어). 엔터프라이즈 고객 확보, 해외 거점</w:t>
+            <w:r>
+              <w:t>12명으로 확장(+데이터, +세일즈, +AM, +엔지니어). 해외 확장, 엔터프라이즈 고객 확보</w:t>
             </w:r>
           </w:p>
         </w:tc>
@@ -15890,27 +14900,7 @@
             <w:shd w:val="clear" w:color="auto" w:fill="F2F2F2" w:themeFill="background1" w:themeFillShade="F2"/>
           </w:tcPr>
           <w:p>
-            <w:pPr>
-              <w:pStyle w:val="TableParagraph"/>
-              <w:spacing w:line="348" w:lineRule="exact"/>
-              <w:ind w:left="82" w:right="73"/>
-              <w:jc w:val="center"/>
-              <w:rPr>
-                <w:rFonts w:asciiTheme="minorEastAsia" w:eastAsiaTheme="minorEastAsia" w:hAnsiTheme="minorEastAsia"/>
-                <w:b/>
-                <w:sz w:val="20"/>
-                <w:szCs w:val="20"/>
-              </w:rPr>
-            </w:pPr>
-            <w:r>
-              <w:rPr>
-                <w:rFonts w:asciiTheme="minorEastAsia" w:eastAsiaTheme="minorEastAsia" w:hAnsiTheme="minorEastAsia" w:hint="eastAsia"/>
-                <w:b/>
-                <w:spacing w:val="-5"/>
-                <w:w w:val="105"/>
-                <w:sz w:val="20"/>
-                <w:szCs w:val="20"/>
-              </w:rPr>
+            <w:r>
               <w:t>시점</w:t>
             </w:r>
           </w:p>
@@ -15924,26 +14914,7 @@
             <w:shd w:val="clear" w:color="auto" w:fill="F2F2F2" w:themeFill="background1" w:themeFillShade="F2"/>
           </w:tcPr>
           <w:p>
-            <w:pPr>
-              <w:pStyle w:val="TableParagraph"/>
-              <w:spacing w:line="348" w:lineRule="exact"/>
-              <w:ind w:left="238" w:right="227"/>
-              <w:jc w:val="center"/>
-              <w:rPr>
-                <w:rFonts w:asciiTheme="minorEastAsia" w:eastAsiaTheme="minorEastAsia" w:hAnsiTheme="minorEastAsia"/>
-                <w:b/>
-                <w:sz w:val="20"/>
-                <w:szCs w:val="20"/>
-              </w:rPr>
-            </w:pPr>
-            <w:r>
-              <w:rPr>
-                <w:rFonts w:asciiTheme="minorEastAsia" w:eastAsiaTheme="minorEastAsia" w:hAnsiTheme="minorEastAsia" w:hint="eastAsia"/>
-                <w:b/>
-                <w:w w:val="105"/>
-                <w:sz w:val="20"/>
-                <w:szCs w:val="20"/>
-              </w:rPr>
+            <w:r>
               <w:t>구분</w:t>
             </w:r>
           </w:p>
@@ -15957,26 +14928,7 @@
             <w:shd w:val="clear" w:color="auto" w:fill="F2F2F2" w:themeFill="background1" w:themeFillShade="F2"/>
           </w:tcPr>
           <w:p>
-            <w:pPr>
-              <w:pStyle w:val="TableParagraph"/>
-              <w:spacing w:line="348" w:lineRule="exact"/>
-              <w:ind w:left="536" w:right="520"/>
-              <w:jc w:val="center"/>
-              <w:rPr>
-                <w:rFonts w:asciiTheme="minorEastAsia" w:eastAsiaTheme="minorEastAsia" w:hAnsiTheme="minorEastAsia"/>
-                <w:b/>
-                <w:sz w:val="20"/>
-                <w:szCs w:val="20"/>
-              </w:rPr>
-            </w:pPr>
-            <w:r>
-              <w:rPr>
-                <w:rFonts w:asciiTheme="minorEastAsia" w:eastAsiaTheme="minorEastAsia" w:hAnsiTheme="minorEastAsia" w:hint="eastAsia"/>
-                <w:b/>
-                <w:w w:val="105"/>
-                <w:sz w:val="20"/>
-                <w:szCs w:val="20"/>
-              </w:rPr>
+            <w:r>
               <w:t>내용</w:t>
             </w:r>
           </w:p>
@@ -15990,26 +14942,7 @@
             <w:shd w:val="clear" w:color="auto" w:fill="F2F2F2" w:themeFill="background1" w:themeFillShade="F2"/>
           </w:tcPr>
           <w:p>
-            <w:pPr>
-              <w:pStyle w:val="TableParagraph"/>
-              <w:spacing w:line="348" w:lineRule="exact"/>
-              <w:ind w:left="290" w:right="270"/>
-              <w:jc w:val="center"/>
-              <w:rPr>
-                <w:rFonts w:asciiTheme="minorEastAsia" w:eastAsiaTheme="minorEastAsia" w:hAnsiTheme="minorEastAsia"/>
-                <w:b/>
-                <w:sz w:val="20"/>
-                <w:szCs w:val="20"/>
-              </w:rPr>
-            </w:pPr>
-            <w:r>
-              <w:rPr>
-                <w:rFonts w:asciiTheme="minorEastAsia" w:eastAsiaTheme="minorEastAsia" w:hAnsiTheme="minorEastAsia" w:hint="eastAsia"/>
-                <w:b/>
-                <w:w w:val="105"/>
-                <w:sz w:val="20"/>
-                <w:szCs w:val="20"/>
-              </w:rPr>
+            <w:r>
               <w:t>금액</w:t>
             </w:r>
           </w:p>
@@ -16027,19 +14960,7 @@
             </w:tcBorders>
           </w:tcPr>
           <w:p>
-            <w:pPr>
-              <w:jc w:val="center"/>
-              <w:rPr>
-                <w:sz w:val="20"/>
-                <w:szCs w:val="20"/>
-              </w:rPr>
-            </w:pPr>
-            <w:r>
-              <w:rPr>
-                <w:rFonts w:ascii="맑은 고딕" w:eastAsia="맑은 고딕" w:hAnsi="맑은 고딕" w:hint="eastAsia"/>
-                <w:sz w:val="20"/>
-                <w:szCs w:val="20"/>
-              </w:rPr>
+            <w:r>
               <w:t>26년 하반기</w:t>
             </w:r>
           </w:p>
@@ -16055,18 +14976,7 @@
             </w:tcMar>
           </w:tcPr>
           <w:p>
-            <w:pPr>
-              <w:rPr>
-                <w:sz w:val="20"/>
-                <w:szCs w:val="20"/>
-              </w:rPr>
-            </w:pPr>
-            <w:r>
-              <w:rPr>
-                <w:rFonts w:ascii="맑은 고딕" w:eastAsia="맑은 고딕" w:hAnsi="맑은 고딕" w:hint="eastAsia"/>
-                <w:sz w:val="20"/>
-                <w:szCs w:val="20"/>
-              </w:rPr>
+            <w:r>
               <w:t>정부지원금</w:t>
             </w:r>
           </w:p>
@@ -16079,20 +14989,8 @@
             </w:tcBorders>
           </w:tcPr>
           <w:p>
-            <w:pPr>
-              <w:jc w:val="center"/>
-              <w:rPr>
-                <w:sz w:val="20"/>
-                <w:szCs w:val="20"/>
-              </w:rPr>
-            </w:pPr>
-            <w:r>
-              <w:rPr>
-                <w:rFonts w:ascii="맑은 고딕" w:eastAsia="맑은 고딕" w:hAnsi="맑은 고딕" w:hint="eastAsia"/>
-                <w:sz w:val="20"/>
-                <w:szCs w:val="20"/>
-              </w:rPr>
-              <w:t>예비창업패키지</w:t>
+            <w:r>
+              <w:t>예비창업패키지. 핵심 엔진 고도화, 웹서비스 제품화, 베타 오픈 준비</w:t>
             </w:r>
           </w:p>
         </w:tc>
@@ -16107,18 +15005,7 @@
             </w:tcMar>
           </w:tcPr>
           <w:p>
-            <w:pPr>
-              <w:rPr>
-                <w:sz w:val="20"/>
-                <w:szCs w:val="20"/>
-              </w:rPr>
-            </w:pPr>
-            <w:r>
-              <w:rPr>
-                <w:rFonts w:ascii="맑은 고딕" w:eastAsia="맑은 고딕" w:hAnsi="맑은 고딕" w:hint="eastAsia"/>
-                <w:sz w:val="20"/>
-                <w:szCs w:val="20"/>
-              </w:rPr>
+            <w:r>
               <w:t>4,000만원</w:t>
             </w:r>
           </w:p>
@@ -16133,19 +15020,7 @@
             <w:tcW w:w="1843" w:type="dxa"/>
           </w:tcPr>
           <w:p>
-            <w:pPr>
-              <w:jc w:val="center"/>
-              <w:rPr>
-                <w:sz w:val="20"/>
-                <w:szCs w:val="20"/>
-              </w:rPr>
-            </w:pPr>
-            <w:r>
-              <w:rPr>
-                <w:rFonts w:ascii="맑은 고딕" w:eastAsia="맑은 고딕" w:hAnsi="맑은 고딕" w:hint="eastAsia"/>
-                <w:sz w:val="20"/>
-                <w:szCs w:val="20"/>
-              </w:rPr>
+            <w:r>
               <w:t>27년 상반기</w:t>
             </w:r>
           </w:p>
@@ -16158,30 +15033,9 @@
             </w:tcMar>
           </w:tcPr>
           <w:p>
-            <w:pPr>
-              <w:rPr>
-                <w:sz w:val="20"/>
-                <w:szCs w:val="20"/>
-              </w:rPr>
-            </w:pPr>
-            <w:r>
-              <w:rPr>
-                <w:rFonts w:ascii="맑은 고딕" w:eastAsia="맑은 고딕" w:hAnsi="맑은 고딕" w:hint="eastAsia"/>
-                <w:sz w:val="20"/>
-                <w:szCs w:val="20"/>
-              </w:rPr>
-              <w:t>민간투자+</w:t>
-            </w:r>
-            <w:proofErr w:type="spellStart"/>
-            <w:r>
-              <w:rPr>
-                <w:rFonts w:ascii="맑은 고딕" w:eastAsia="맑은 고딕" w:hAnsi="맑은 고딕" w:hint="eastAsia"/>
-                <w:sz w:val="20"/>
-                <w:szCs w:val="20"/>
-              </w:rPr>
-              <w:t>정부매칭</w:t>
-            </w:r>
-            <w:proofErr w:type="spellEnd"/>
+            <w:r>
+              <w:t>민간투자+정부매칭</w:t>
+            </w:r>
           </w:p>
         </w:tc>
         <w:tc>
@@ -16189,20 +15043,8 @@
             <w:tcW w:w="4110" w:type="dxa"/>
           </w:tcPr>
           <w:p>
-            <w:pPr>
-              <w:jc w:val="center"/>
-              <w:rPr>
-                <w:sz w:val="20"/>
-                <w:szCs w:val="20"/>
-              </w:rPr>
-            </w:pPr>
-            <w:r>
-              <w:rPr>
-                <w:rFonts w:ascii="맑은 고딕" w:eastAsia="맑은 고딕" w:hAnsi="맑은 고딕" w:hint="eastAsia"/>
-                <w:sz w:val="20"/>
-                <w:szCs w:val="20"/>
-              </w:rPr>
-              <w:t>TIPS(민간투자1억+정부최대6억)</w:t>
+            <w:r>
+              <w:t>TIPS. 온라인 광고 본격 집행, 글로벌 PLG 초기 유입 확보, 27년 580건 판매건수 달성, 28년 손익분기 통과까지의 운영 안전판 확보</w:t>
             </w:r>
           </w:p>
         </w:tc>
@@ -16214,19 +15056,8 @@
             </w:tcMar>
           </w:tcPr>
           <w:p>
-            <w:pPr>
-              <w:rPr>
-                <w:sz w:val="20"/>
-                <w:szCs w:val="20"/>
-              </w:rPr>
-            </w:pPr>
-            <w:r>
-              <w:rPr>
-                <w:rFonts w:ascii="맑은 고딕" w:eastAsia="맑은 고딕" w:hAnsi="맑은 고딕" w:hint="eastAsia"/>
-                <w:sz w:val="20"/>
-                <w:szCs w:val="20"/>
-              </w:rPr>
-              <w:t>최대 7억원</w:t>
+            <w:r>
+              <w:t>최대 13억원</w:t>
             </w:r>
           </w:p>
         </w:tc>
@@ -16240,21 +15071,8 @@
             <w:tcW w:w="1843" w:type="dxa"/>
           </w:tcPr>
           <w:p>
-            <w:pPr>
-              <w:jc w:val="center"/>
-              <w:rPr>
-                <w:rFonts w:ascii="맑은 고딕" w:eastAsia="맑은 고딕" w:hAnsi="맑은 고딕" w:hint="eastAsia"/>
-                <w:sz w:val="20"/>
-                <w:szCs w:val="20"/>
-              </w:rPr>
-            </w:pPr>
-            <w:r>
-              <w:rPr>
-                <w:rFonts w:ascii="맑은 고딕" w:eastAsia="맑은 고딕" w:hAnsi="맑은 고딕" w:hint="eastAsia"/>
-                <w:sz w:val="20"/>
-                <w:szCs w:val="20"/>
-              </w:rPr>
-              <w:t>28년 상반기</w:t>
+            <w:r>
+              <w:t>28년 하반기</w:t>
             </w:r>
           </w:p>
         </w:tc>
@@ -16266,19 +15084,7 @@
             </w:tcMar>
           </w:tcPr>
           <w:p>
-            <w:pPr>
-              <w:rPr>
-                <w:rFonts w:ascii="맑은 고딕" w:eastAsia="맑은 고딕" w:hAnsi="맑은 고딕" w:hint="eastAsia"/>
-                <w:sz w:val="20"/>
-                <w:szCs w:val="20"/>
-              </w:rPr>
-            </w:pPr>
-            <w:r>
-              <w:rPr>
-                <w:rFonts w:ascii="맑은 고딕" w:eastAsia="맑은 고딕" w:hAnsi="맑은 고딕" w:hint="eastAsia"/>
-                <w:sz w:val="20"/>
-                <w:szCs w:val="20"/>
-              </w:rPr>
+            <w:r>
               <w:t>민간투자</w:t>
             </w:r>
           </w:p>
@@ -16288,21 +15094,8 @@
             <w:tcW w:w="4110" w:type="dxa"/>
           </w:tcPr>
           <w:p>
-            <w:pPr>
-              <w:jc w:val="center"/>
-              <w:rPr>
-                <w:rFonts w:ascii="맑은 고딕" w:eastAsia="맑은 고딕" w:hAnsi="맑은 고딕" w:hint="eastAsia"/>
-                <w:sz w:val="20"/>
-                <w:szCs w:val="20"/>
-              </w:rPr>
-            </w:pPr>
-            <w:r>
-              <w:rPr>
-                <w:rFonts w:ascii="맑은 고딕" w:eastAsia="맑은 고딕" w:hAnsi="맑은 고딕" w:hint="eastAsia"/>
-                <w:sz w:val="20"/>
-                <w:szCs w:val="20"/>
-              </w:rPr>
-              <w:t>시리즈A</w:t>
+            <w:r>
+              <w:t>시리즈A. 엔터프라이즈 고객 확대, 해외 확장, 팀 확충, 29년 7,000건 판매 체제 구축</w:t>
             </w:r>
           </w:p>
         </w:tc>
@@ -16314,20 +15107,8 @@
             </w:tcMar>
           </w:tcPr>
           <w:p>
-            <w:pPr>
-              <w:rPr>
-                <w:rFonts w:ascii="맑은 고딕" w:eastAsia="맑은 고딕" w:hAnsi="맑은 고딕" w:hint="eastAsia"/>
-                <w:sz w:val="20"/>
-                <w:szCs w:val="20"/>
-              </w:rPr>
-            </w:pPr>
-            <w:r>
-              <w:rPr>
-                <w:rFonts w:ascii="맑은 고딕" w:eastAsia="맑은 고딕" w:hAnsi="맑은 고딕" w:hint="eastAsia"/>
-                <w:sz w:val="20"/>
-                <w:szCs w:val="20"/>
-              </w:rPr>
-              <w:t>약5억원</w:t>
+            <w:r>
+              <w:t>약 10억원</w:t>
             </w:r>
           </w:p>
         </w:tc>

</xml_diff>

<commit_message>
docs: compress business model and revenue tables
</commit_message>
<xml_diff>
--- a/docs/예창패 실제 제풀용/claudecode/2026년 예비창업패키지 사업계획서_페르소닉AI_수정중_SOM수정_cc_BM수정.docx
+++ b/docs/예창패 실제 제풀용/claudecode/2026년 예비창업패키지 사업계획서_페르소닉AI_수정중_SOM수정_cc_BM수정.docx
@@ -13333,36 +13333,7 @@
         </w:rPr>
       </w:pPr>
       <w:r>
-        <w:rPr>
-          <w:rFonts w:asciiTheme="minorEastAsia" w:eastAsiaTheme="minorEastAsia" w:hAnsiTheme="minorEastAsia"/>
-          <w:b/>
-          <w:bCs/>
-        </w:rPr>
-        <w:t>비즈니스 모델 (수익화 모델</w:t>
-      </w:r>
-      <w:proofErr w:type="gramStart"/>
-      <w:r>
-        <w:rPr>
-          <w:rFonts w:asciiTheme="minorEastAsia" w:eastAsiaTheme="minorEastAsia" w:hAnsiTheme="minorEastAsia"/>
-          <w:b/>
-          <w:bCs/>
-        </w:rPr>
-        <w:t>) :</w:t>
-      </w:r>
-      <w:proofErr w:type="gramEnd"/>
-      <w:r>
-        <w:rPr>
-          <w:rFonts w:asciiTheme="minorEastAsia" w:eastAsiaTheme="minorEastAsia" w:hAnsiTheme="minorEastAsia"/>
-          <w:b/>
-          <w:bCs/>
-        </w:rPr>
-        <w:t xml:space="preserve"> </w:t>
-      </w:r>
-      <w:r>
-        <w:rPr>
-          <w:rFonts w:asciiTheme="minorEastAsia" w:eastAsiaTheme="minorEastAsia" w:hAnsiTheme="minorEastAsia"/>
-        </w:rPr>
-        <w:t>건별 과금(PAYG)으로 시작하여, 28년부터 월·연간 구독과 엔터프라이즈 연간 계약을 추가한다. 원가의 대부분은 LLM API 비용이며, LLM 가격 하락 추세에 따라 마진은 자동으로 개선된다. 1건(30페르소나) 기준 건당 손익 구조는 다음과 같다.</w:t>
+        <w:t>비즈니스 모델 (수익화 모델) : 건별 과금(PAYG)으로 시작하여, 28년부터 월·연간 구독과 엔터프라이즈 연간 계약을 추가한다. 원가의 대부분은 LLM API와 시뮬레이션 컴퓨팅 비용이며, 3개 서비스 유형 모두 건당 공헌이익이 양수인 구조다. 각 서비스 유형의 가격, 원가, 공헌이익률은 다음과 같다.</w:t>
       </w:r>
     </w:p>
     <w:tbl>
@@ -13385,20 +13356,7 @@
             <w:shd w:val="clear" w:color="auto" w:fill="F2F2F2" w:themeFill="background1" w:themeFillShade="F2"/>
           </w:tcPr>
           <w:p>
-            <w:pPr>
-              <w:jc w:val="center"/>
-              <w:rPr>
-                <w:sz w:val="20"/>
-                <w:szCs w:val="20"/>
-              </w:rPr>
-            </w:pPr>
-            <w:r>
-              <w:rPr>
-                <w:rFonts w:ascii="맑은 고딕" w:eastAsia="맑은 고딕" w:hAnsi="맑은 고딕"/>
-                <w:b/>
-                <w:sz w:val="20"/>
-                <w:szCs w:val="20"/>
-              </w:rPr>
+            <w:r>
               <w:t>구분</w:t>
             </w:r>
           </w:p>
@@ -13409,33 +13367,9 @@
             <w:shd w:val="clear" w:color="auto" w:fill="F2F2F2" w:themeFill="background1" w:themeFillShade="F2"/>
           </w:tcPr>
           <w:p>
-            <w:pPr>
-              <w:jc w:val="center"/>
-              <w:rPr>
-                <w:sz w:val="20"/>
-                <w:szCs w:val="20"/>
-              </w:rPr>
-            </w:pPr>
-            <w:r>
-              <w:rPr>
-                <w:rFonts w:ascii="맑은 고딕" w:eastAsia="맑은 고딕" w:hAnsi="맑은 고딕"/>
-                <w:b/>
-                <w:sz w:val="20"/>
-                <w:szCs w:val="20"/>
-              </w:rPr>
-              <w:t xml:space="preserve">합성 </w:t>
-            </w:r>
-            <w:proofErr w:type="spellStart"/>
-            <w:r>
-              <w:rPr>
-                <w:rFonts w:ascii="맑은 고딕" w:eastAsia="맑은 고딕" w:hAnsi="맑은 고딕"/>
-                <w:b/>
-                <w:sz w:val="20"/>
-                <w:szCs w:val="20"/>
-              </w:rPr>
-              <w:t>서베이</w:t>
-            </w:r>
-            <w:proofErr w:type="spellEnd"/>
+            <w:r>
+              <w:t>합성 서베이</w:t>
+            </w:r>
           </w:p>
         </w:tc>
         <w:tc>
@@ -13444,20 +13378,7 @@
             <w:shd w:val="clear" w:color="auto" w:fill="F2F2F2" w:themeFill="background1" w:themeFillShade="F2"/>
           </w:tcPr>
           <w:p>
-            <w:pPr>
-              <w:jc w:val="center"/>
-              <w:rPr>
-                <w:sz w:val="20"/>
-                <w:szCs w:val="20"/>
-              </w:rPr>
-            </w:pPr>
-            <w:r>
-              <w:rPr>
-                <w:rFonts w:ascii="맑은 고딕" w:eastAsia="맑은 고딕" w:hAnsi="맑은 고딕"/>
-                <w:b/>
-                <w:sz w:val="20"/>
-                <w:szCs w:val="20"/>
-              </w:rPr>
+            <w:r>
               <w:t>UI/UX 리뷰</w:t>
             </w:r>
           </w:p>
@@ -13468,20 +13389,7 @@
             <w:shd w:val="clear" w:color="auto" w:fill="F2F2F2" w:themeFill="background1" w:themeFillShade="F2"/>
           </w:tcPr>
           <w:p>
-            <w:pPr>
-              <w:jc w:val="center"/>
-              <w:rPr>
-                <w:sz w:val="20"/>
-                <w:szCs w:val="20"/>
-              </w:rPr>
-            </w:pPr>
-            <w:r>
-              <w:rPr>
-                <w:rFonts w:ascii="맑은 고딕" w:eastAsia="맑은 고딕" w:hAnsi="맑은 고딕"/>
-                <w:b/>
-                <w:sz w:val="20"/>
-                <w:szCs w:val="20"/>
-              </w:rPr>
+            <w:r>
               <w:t>제품 사용 시뮬레이션</w:t>
             </w:r>
           </w:p>
@@ -13493,18 +13401,7 @@
             <w:tcW w:w="2552" w:type="dxa"/>
           </w:tcPr>
           <w:p>
-            <w:pPr>
-              <w:rPr>
-                <w:sz w:val="20"/>
-                <w:szCs w:val="20"/>
-              </w:rPr>
-            </w:pPr>
-            <w:r>
-              <w:rPr>
-                <w:rFonts w:ascii="맑은 고딕" w:eastAsia="맑은 고딕" w:hAnsi="맑은 고딕"/>
-                <w:sz w:val="20"/>
-                <w:szCs w:val="20"/>
-              </w:rPr>
+            <w:r>
               <w:t>판매가</w:t>
             </w:r>
           </w:p>
@@ -13514,19 +13411,7 @@
             <w:tcW w:w="2865" w:type="dxa"/>
           </w:tcPr>
           <w:p>
-            <w:pPr>
-              <w:jc w:val="center"/>
-              <w:rPr>
-                <w:sz w:val="20"/>
-                <w:szCs w:val="20"/>
-              </w:rPr>
-            </w:pPr>
-            <w:r>
-              <w:rPr>
-                <w:rFonts w:ascii="맑은 고딕" w:eastAsia="맑은 고딕" w:hAnsi="맑은 고딕"/>
-                <w:sz w:val="20"/>
-                <w:szCs w:val="20"/>
-              </w:rPr>
+            <w:r>
               <w:t>$39</w:t>
             </w:r>
           </w:p>
@@ -13536,19 +13421,7 @@
             <w:tcW w:w="2408" w:type="dxa"/>
           </w:tcPr>
           <w:p>
-            <w:pPr>
-              <w:jc w:val="center"/>
-              <w:rPr>
-                <w:sz w:val="20"/>
-                <w:szCs w:val="20"/>
-              </w:rPr>
-            </w:pPr>
-            <w:r>
-              <w:rPr>
-                <w:rFonts w:ascii="맑은 고딕" w:eastAsia="맑은 고딕" w:hAnsi="맑은 고딕"/>
-                <w:sz w:val="20"/>
-                <w:szCs w:val="20"/>
-              </w:rPr>
+            <w:r>
               <w:t>$69</w:t>
             </w:r>
           </w:p>
@@ -13558,19 +13431,7 @@
             <w:tcW w:w="3232" w:type="dxa"/>
           </w:tcPr>
           <w:p>
-            <w:pPr>
-              <w:jc w:val="center"/>
-              <w:rPr>
-                <w:sz w:val="20"/>
-                <w:szCs w:val="20"/>
-              </w:rPr>
-            </w:pPr>
-            <w:r>
-              <w:rPr>
-                <w:rFonts w:ascii="맑은 고딕" w:eastAsia="맑은 고딕" w:hAnsi="맑은 고딕"/>
-                <w:sz w:val="20"/>
-                <w:szCs w:val="20"/>
-              </w:rPr>
+            <w:r>
               <w:t>$149</w:t>
             </w:r>
           </w:p>
@@ -13582,35 +13443,8 @@
             <w:tcW w:w="2552" w:type="dxa"/>
           </w:tcPr>
           <w:p>
-            <w:pPr>
-              <w:rPr>
-                <w:sz w:val="20"/>
-                <w:szCs w:val="20"/>
-              </w:rPr>
-            </w:pPr>
-            <w:r>
-              <w:rPr>
-                <w:rFonts w:ascii="맑은 고딕" w:eastAsia="맑은 고딕" w:hAnsi="맑은 고딕"/>
-                <w:sz w:val="20"/>
-                <w:szCs w:val="20"/>
-              </w:rPr>
-              <w:t>원가(</w:t>
-            </w:r>
-            <w:r>
-              <w:rPr>
-                <w:rFonts w:ascii="맑은 고딕" w:eastAsia="맑은 고딕" w:hAnsi="맑은 고딕" w:hint="eastAsia"/>
-                <w:sz w:val="20"/>
-                <w:szCs w:val="20"/>
-              </w:rPr>
-              <w:t>컴퓨팅</w:t>
-            </w:r>
-            <w:r>
-              <w:rPr>
-                <w:rFonts w:ascii="맑은 고딕" w:eastAsia="맑은 고딕" w:hAnsi="맑은 고딕"/>
-                <w:sz w:val="20"/>
-                <w:szCs w:val="20"/>
-              </w:rPr>
-              <w:t>+LLM)</w:t>
+            <w:r>
+              <w:t>원가(LLM+컴퓨팅)</w:t>
             </w:r>
           </w:p>
         </w:tc>
@@ -13619,19 +13453,7 @@
             <w:tcW w:w="2865" w:type="dxa"/>
           </w:tcPr>
           <w:p>
-            <w:pPr>
-              <w:jc w:val="center"/>
-              <w:rPr>
-                <w:sz w:val="20"/>
-                <w:szCs w:val="20"/>
-              </w:rPr>
-            </w:pPr>
-            <w:r>
-              <w:rPr>
-                <w:rFonts w:ascii="맑은 고딕" w:eastAsia="맑은 고딕" w:hAnsi="맑은 고딕"/>
-                <w:sz w:val="20"/>
-                <w:szCs w:val="20"/>
-              </w:rPr>
+            <w:r>
               <w:t>$5.10</w:t>
             </w:r>
           </w:p>
@@ -13641,19 +13463,7 @@
             <w:tcW w:w="2408" w:type="dxa"/>
           </w:tcPr>
           <w:p>
-            <w:pPr>
-              <w:jc w:val="center"/>
-              <w:rPr>
-                <w:sz w:val="20"/>
-                <w:szCs w:val="20"/>
-              </w:rPr>
-            </w:pPr>
-            <w:r>
-              <w:rPr>
-                <w:rFonts w:ascii="맑은 고딕" w:eastAsia="맑은 고딕" w:hAnsi="맑은 고딕"/>
-                <w:sz w:val="20"/>
-                <w:szCs w:val="20"/>
-              </w:rPr>
+            <w:r>
               <w:t>$9.00</w:t>
             </w:r>
           </w:p>
@@ -13663,19 +13473,7 @@
             <w:tcW w:w="3232" w:type="dxa"/>
           </w:tcPr>
           <w:p>
-            <w:pPr>
-              <w:jc w:val="center"/>
-              <w:rPr>
-                <w:sz w:val="20"/>
-                <w:szCs w:val="20"/>
-              </w:rPr>
-            </w:pPr>
-            <w:r>
-              <w:rPr>
-                <w:rFonts w:ascii="맑은 고딕" w:eastAsia="맑은 고딕" w:hAnsi="맑은 고딕"/>
-                <w:sz w:val="20"/>
-                <w:szCs w:val="20"/>
-              </w:rPr>
+            <w:r>
               <w:t>$38.00</w:t>
             </w:r>
           </w:p>
@@ -13687,22 +13485,9 @@
             <w:tcW w:w="2552" w:type="dxa"/>
           </w:tcPr>
           <w:p>
-            <w:pPr>
-              <w:rPr>
-                <w:sz w:val="20"/>
-                <w:szCs w:val="20"/>
-              </w:rPr>
-            </w:pPr>
-            <w:proofErr w:type="spellStart"/>
-            <w:r>
-              <w:rPr>
-                <w:rFonts w:ascii="맑은 고딕" w:eastAsia="맑은 고딕" w:hAnsi="맑은 고딕"/>
-                <w:sz w:val="20"/>
-                <w:szCs w:val="20"/>
-              </w:rPr>
-              <w:t>매출총이익률</w:t>
-            </w:r>
-            <w:proofErr w:type="spellEnd"/>
+            <w:r>
+              <w:t>건당 공헌이익률</w:t>
+            </w:r>
           </w:p>
         </w:tc>
         <w:tc>
@@ -13710,20 +13495,8 @@
             <w:tcW w:w="2865" w:type="dxa"/>
           </w:tcPr>
           <w:p>
-            <w:pPr>
-              <w:jc w:val="center"/>
-              <w:rPr>
-                <w:sz w:val="20"/>
-                <w:szCs w:val="20"/>
-              </w:rPr>
-            </w:pPr>
-            <w:r>
-              <w:rPr>
-                <w:rFonts w:ascii="맑은 고딕" w:eastAsia="맑은 고딕" w:hAnsi="맑은 고딕"/>
-                <w:sz w:val="20"/>
-                <w:szCs w:val="20"/>
-              </w:rPr>
-              <w:t>87%</w:t>
+            <w:r>
+              <w:t>80%</w:t>
             </w:r>
           </w:p>
         </w:tc>
@@ -13732,20 +13505,8 @@
             <w:tcW w:w="2408" w:type="dxa"/>
           </w:tcPr>
           <w:p>
-            <w:pPr>
-              <w:jc w:val="center"/>
-              <w:rPr>
-                <w:sz w:val="20"/>
-                <w:szCs w:val="20"/>
-              </w:rPr>
-            </w:pPr>
-            <w:r>
-              <w:rPr>
-                <w:rFonts w:ascii="맑은 고딕" w:eastAsia="맑은 고딕" w:hAnsi="맑은 고딕"/>
-                <w:sz w:val="20"/>
-                <w:szCs w:val="20"/>
-              </w:rPr>
-              <w:t>87%</w:t>
+            <w:r>
+              <w:t>81%</w:t>
             </w:r>
           </w:p>
         </w:tc>
@@ -13754,202 +13515,8 @@
             <w:tcW w:w="3232" w:type="dxa"/>
           </w:tcPr>
           <w:p>
-            <w:pPr>
-              <w:jc w:val="center"/>
-              <w:rPr>
-                <w:sz w:val="20"/>
-                <w:szCs w:val="20"/>
-              </w:rPr>
-            </w:pPr>
-            <w:r>
-              <w:rPr>
-                <w:rFonts w:ascii="맑은 고딕" w:eastAsia="맑은 고딕" w:hAnsi="맑은 고딕"/>
-                <w:sz w:val="20"/>
-                <w:szCs w:val="20"/>
-              </w:rPr>
-              <w:t>75%</w:t>
-            </w:r>
-          </w:p>
-        </w:tc>
-      </w:tr>
-      <w:tr>
-        <w:tc>
-          <w:tcPr>
-            <w:tcW w:w="2552" w:type="dxa"/>
-          </w:tcPr>
-          <w:p>
-            <w:pPr>
-              <w:rPr>
-                <w:sz w:val="20"/>
-                <w:szCs w:val="20"/>
-              </w:rPr>
-            </w:pPr>
-            <w:r>
-              <w:rPr>
-                <w:rFonts w:ascii="맑은 고딕" w:eastAsia="맑은 고딕" w:hAnsi="맑은 고딕"/>
-                <w:sz w:val="20"/>
-                <w:szCs w:val="20"/>
-              </w:rPr>
-              <w:t>부대비용(결제·충당금)</w:t>
-            </w:r>
-          </w:p>
-        </w:tc>
-        <w:tc>
-          <w:tcPr>
-            <w:tcW w:w="2865" w:type="dxa"/>
-          </w:tcPr>
-          <w:p>
-            <w:pPr>
-              <w:jc w:val="center"/>
-              <w:rPr>
-                <w:sz w:val="20"/>
-                <w:szCs w:val="20"/>
-              </w:rPr>
-            </w:pPr>
-            <w:r>
-              <w:rPr>
-                <w:rFonts w:ascii="맑은 고딕" w:eastAsia="맑은 고딕" w:hAnsi="맑은 고딕"/>
-                <w:sz w:val="20"/>
-                <w:szCs w:val="20"/>
-              </w:rPr>
-              <w:t>$2.60</w:t>
-            </w:r>
-          </w:p>
-        </w:tc>
-        <w:tc>
-          <w:tcPr>
-            <w:tcW w:w="2408" w:type="dxa"/>
-          </w:tcPr>
-          <w:p>
-            <w:pPr>
-              <w:jc w:val="center"/>
-              <w:rPr>
-                <w:sz w:val="20"/>
-                <w:szCs w:val="20"/>
-              </w:rPr>
-            </w:pPr>
-            <w:r>
-              <w:rPr>
-                <w:rFonts w:ascii="맑은 고딕" w:eastAsia="맑은 고딕" w:hAnsi="맑은 고딕"/>
-                <w:sz w:val="20"/>
-                <w:szCs w:val="20"/>
-              </w:rPr>
-              <w:t>$4.37</w:t>
-            </w:r>
-          </w:p>
-        </w:tc>
-        <w:tc>
-          <w:tcPr>
-            <w:tcW w:w="3232" w:type="dxa"/>
-          </w:tcPr>
-          <w:p>
-            <w:pPr>
-              <w:jc w:val="center"/>
-              <w:rPr>
-                <w:sz w:val="20"/>
-                <w:szCs w:val="20"/>
-              </w:rPr>
-            </w:pPr>
-            <w:r>
-              <w:rPr>
-                <w:rFonts w:ascii="맑은 고딕" w:eastAsia="맑은 고딕" w:hAnsi="맑은 고딕"/>
-                <w:sz w:val="20"/>
-                <w:szCs w:val="20"/>
-              </w:rPr>
-              <w:t>$9.09</w:t>
-            </w:r>
-          </w:p>
-        </w:tc>
-      </w:tr>
-      <w:tr>
-        <w:tc>
-          <w:tcPr>
-            <w:tcW w:w="2552" w:type="dxa"/>
-          </w:tcPr>
-          <w:p>
-            <w:pPr>
-              <w:rPr>
-                <w:sz w:val="20"/>
-                <w:szCs w:val="20"/>
-              </w:rPr>
-            </w:pPr>
-            <w:r>
-              <w:rPr>
-                <w:rFonts w:ascii="맑은 고딕" w:eastAsia="맑은 고딕" w:hAnsi="맑은 고딕"/>
-                <w:b/>
-                <w:sz w:val="20"/>
-                <w:szCs w:val="20"/>
-              </w:rPr>
-              <w:t>건당 공헌이익</w:t>
-            </w:r>
-          </w:p>
-        </w:tc>
-        <w:tc>
-          <w:tcPr>
-            <w:tcW w:w="2865" w:type="dxa"/>
-          </w:tcPr>
-          <w:p>
-            <w:pPr>
-              <w:jc w:val="center"/>
-              <w:rPr>
-                <w:sz w:val="20"/>
-                <w:szCs w:val="20"/>
-              </w:rPr>
-            </w:pPr>
-            <w:r>
-              <w:rPr>
-                <w:rFonts w:ascii="맑은 고딕" w:eastAsia="맑은 고딕" w:hAnsi="맑은 고딕"/>
-                <w:b/>
-                <w:sz w:val="20"/>
-                <w:szCs w:val="20"/>
-              </w:rPr>
-              <w:t>$31.30 (80%)</w:t>
-            </w:r>
-          </w:p>
-        </w:tc>
-        <w:tc>
-          <w:tcPr>
-            <w:tcW w:w="2408" w:type="dxa"/>
-          </w:tcPr>
-          <w:p>
-            <w:pPr>
-              <w:jc w:val="center"/>
-              <w:rPr>
-                <w:sz w:val="20"/>
-                <w:szCs w:val="20"/>
-              </w:rPr>
-            </w:pPr>
-            <w:r>
-              <w:rPr>
-                <w:rFonts w:ascii="맑은 고딕" w:eastAsia="맑은 고딕" w:hAnsi="맑은 고딕"/>
-                <w:b/>
-                <w:sz w:val="20"/>
-                <w:szCs w:val="20"/>
-              </w:rPr>
-              <w:t>$55.63 (81%)</w:t>
-            </w:r>
-          </w:p>
-        </w:tc>
-        <w:tc>
-          <w:tcPr>
-            <w:tcW w:w="3232" w:type="dxa"/>
-          </w:tcPr>
-          <w:p>
-            <w:pPr>
-              <w:jc w:val="center"/>
-              <w:rPr>
-                <w:sz w:val="20"/>
-                <w:szCs w:val="20"/>
-              </w:rPr>
-            </w:pPr>
-            <w:r>
-              <w:rPr>
-                <w:rFonts w:ascii="맑은 고딕" w:eastAsia="맑은 고딕" w:hAnsi="맑은 고딕"/>
-                <w:b/>
-                <w:sz w:val="20"/>
-                <w:szCs w:val="20"/>
-              </w:rPr>
-              <w:t>$101.91 (68%)</w:t>
+            <w:r>
+              <w:t>68%</w:t>
             </w:r>
           </w:p>
         </w:tc>
@@ -14045,7 +13612,7 @@
           </w:tcPr>
           <w:p>
             <w:r>
-              <w:t>연간 유료 판매건수</w:t>
+              <w:t>건수/단가</w:t>
             </w:r>
           </w:p>
         </w:tc>
@@ -14055,7 +13622,7 @@
           </w:tcPr>
           <w:p>
             <w:r>
-              <w:t>580건</w:t>
+              <w:t>580건 × $500</w:t>
             </w:r>
           </w:p>
         </w:tc>
@@ -14065,7 +13632,7 @@
           </w:tcPr>
           <w:p>
             <w:r>
-              <w:t>3,000건</w:t>
+              <w:t>3,000건 × $1,000</w:t>
             </w:r>
           </w:p>
         </w:tc>
@@ -14075,7 +13642,7 @@
           </w:tcPr>
           <w:p>
             <w:r>
-              <w:t>7,000건</w:t>
+              <w:t>7,000건 × $1,500</w:t>
             </w:r>
           </w:p>
         </w:tc>
@@ -14090,7 +13657,7 @@
           </w:tcPr>
           <w:p>
             <w:r>
-              <w:t>평균 판매단가</w:t>
+              <w:t>고객획득 구조</w:t>
             </w:r>
           </w:p>
         </w:tc>
@@ -14100,7 +13667,7 @@
           </w:tcPr>
           <w:p>
             <w:r>
-              <w:t>$500</w:t>
+              <w:t>광고 85% / 비광고 15%</w:t>
             </w:r>
           </w:p>
         </w:tc>
@@ -14110,7 +13677,7 @@
           </w:tcPr>
           <w:p>
             <w:r>
-              <w:t>$1,000</w:t>
+              <w:t>광고 75% / 비광고 25%</w:t>
             </w:r>
           </w:p>
         </w:tc>
@@ -14120,7 +13687,7 @@
           </w:tcPr>
           <w:p>
             <w:r>
-              <w:t>$1,500</w:t>
+              <w:t>광고 70% / 비광고 30%</w:t>
             </w:r>
           </w:p>
         </w:tc>
@@ -14180,9 +13747,7 @@
           </w:tcPr>
           <w:p>
             <w:r>
-              <w:t>유료광고 /</w:t>
-              <w:br/>
-              <w:t>콘텐츠·오가닉·PLG 비중</w:t>
+              <w:t>매출원가</w:t>
             </w:r>
           </w:p>
         </w:tc>
@@ -14192,7 +13757,7 @@
           </w:tcPr>
           <w:p>
             <w:r>
-              <w:t>85% / 15%</w:t>
+              <w:t>-$67K (23%)</w:t>
             </w:r>
           </w:p>
         </w:tc>
@@ -14202,7 +13767,7 @@
           </w:tcPr>
           <w:p>
             <w:r>
-              <w:t>75% / 25%</w:t>
+              <w:t>-$630K (21%)</w:t>
             </w:r>
           </w:p>
         </w:tc>
@@ -14212,7 +13777,7 @@
           </w:tcPr>
           <w:p>
             <w:r>
-              <w:t>70% / 30%</w:t>
+              <w:t>-$1,890K (18%)</w:t>
             </w:r>
           </w:p>
         </w:tc>
@@ -14227,7 +13792,7 @@
           </w:tcPr>
           <w:p>
             <w:r>
-              <w:t>마케팅비</w:t>
+              <w:t>매출손익</w:t>
             </w:r>
           </w:p>
         </w:tc>
@@ -14237,7 +13802,7 @@
           </w:tcPr>
           <w:p>
             <w:r>
-              <w:t>-$275K</w:t>
+              <w:t>$223K (77%)</w:t>
             </w:r>
           </w:p>
         </w:tc>
@@ -14247,7 +13812,7 @@
           </w:tcPr>
           <w:p>
             <w:r>
-              <w:t>-$1,256K</w:t>
+              <w:t>$2,370K (79%)</w:t>
             </w:r>
           </w:p>
         </w:tc>
@@ -14257,7 +13822,7 @@
           </w:tcPr>
           <w:p>
             <w:r>
-              <w:t>-$2,734K</w:t>
+              <w:t>$8,610K (82%)</w:t>
             </w:r>
           </w:p>
         </w:tc>
@@ -14269,7 +13834,7 @@
           </w:tcPr>
           <w:p>
             <w:r>
-              <w:t>매출원가</w:t>
+              <w:t>영업이익</w:t>
             </w:r>
           </w:p>
         </w:tc>
@@ -14279,7 +13844,7 @@
           </w:tcPr>
           <w:p>
             <w:r>
-              <w:t>-$67K (23%)</w:t>
+              <w:t>-$236K</w:t>
             </w:r>
           </w:p>
         </w:tc>
@@ -14289,7 +13854,7 @@
           </w:tcPr>
           <w:p>
             <w:r>
-              <w:t>-$630K (21%)</w:t>
+              <w:t>$15K</w:t>
             </w:r>
           </w:p>
         </w:tc>
@@ -14299,7 +13864,7 @@
           </w:tcPr>
           <w:p>
             <w:r>
-              <w:t>-$1,890K (18%)</w:t>
+              <w:t>$2,100K</w:t>
             </w:r>
           </w:p>
         </w:tc>
@@ -14311,7 +13876,7 @@
           </w:tcPr>
           <w:p>
             <w:r>
-              <w:t>매출손익</w:t>
+              <w:t>영업이익률</w:t>
             </w:r>
           </w:p>
         </w:tc>
@@ -14321,7 +13886,7 @@
           </w:tcPr>
           <w:p>
             <w:r>
-              <w:t>$223K (77%)</w:t>
+              <w:t>-81%</w:t>
             </w:r>
           </w:p>
         </w:tc>
@@ -14331,139 +13896,13 @@
           </w:tcPr>
           <w:p>
             <w:r>
-              <w:t>$2,370K (79%)</w:t>
+              <w:t>0.5%</w:t>
             </w:r>
           </w:p>
         </w:tc>
         <w:tc>
           <w:tcPr>
             <w:tcW w:w="3402" w:type="dxa"/>
-          </w:tcPr>
-          <w:p>
-            <w:r>
-              <w:t>$8,610K (82%)</w:t>
-            </w:r>
-          </w:p>
-        </w:tc>
-      </w:tr>
-      <w:tr>
-        <w:tc>
-          <w:tcPr>
-            <w:tcW w:w="2836" w:type="dxa"/>
-          </w:tcPr>
-          <w:p>
-            <w:r>
-              <w:t>판관비 합계</w:t>
-            </w:r>
-          </w:p>
-        </w:tc>
-        <w:tc>
-          <w:tcPr>
-            <w:tcW w:w="2693" w:type="dxa"/>
-          </w:tcPr>
-          <w:p>
-            <w:r>
-              <w:t>-$459K</w:t>
-            </w:r>
-          </w:p>
-        </w:tc>
-        <w:tc>
-          <w:tcPr>
-            <w:tcW w:w="2126" w:type="dxa"/>
-          </w:tcPr>
-          <w:p>
-            <w:r>
-              <w:t>-$2,355K</w:t>
-            </w:r>
-          </w:p>
-        </w:tc>
-        <w:tc>
-          <w:tcPr>
-            <w:tcW w:w="3402" w:type="dxa"/>
-          </w:tcPr>
-          <w:p>
-            <w:r>
-              <w:t>-$6,510K</w:t>
-            </w:r>
-          </w:p>
-        </w:tc>
-      </w:tr>
-      <w:tr>
-        <w:tc>
-          <w:tcPr>
-            <w:tcW w:w="2836" w:type="dxa"/>
-          </w:tcPr>
-          <w:p>
-            <w:r>
-              <w:t>영업이익</w:t>
-            </w:r>
-          </w:p>
-        </w:tc>
-        <w:tc>
-          <w:tcPr>
-            <w:tcW w:w="2693" w:type="dxa"/>
-          </w:tcPr>
-          <w:p>
-            <w:r>
-              <w:t>-$236K</w:t>
-            </w:r>
-          </w:p>
-        </w:tc>
-        <w:tc>
-          <w:tcPr>
-            <w:tcW w:w="2126" w:type="dxa"/>
-          </w:tcPr>
-          <w:p>
-            <w:r>
-              <w:t>$15K</w:t>
-            </w:r>
-          </w:p>
-        </w:tc>
-        <w:tc>
-          <w:tcPr>
-            <w:tcW w:w="3402" w:type="dxa"/>
-          </w:tcPr>
-          <w:p>
-            <w:r>
-              <w:t>$2,100K</w:t>
-            </w:r>
-          </w:p>
-        </w:tc>
-      </w:tr>
-      <w:tr>
-        <w:tc>
-          <w:tcPr>
-            <w:tcW w:type="dxa" w:w="2836"/>
-          </w:tcPr>
-          <w:p>
-            <w:r>
-              <w:t>영업이익률</w:t>
-            </w:r>
-          </w:p>
-        </w:tc>
-        <w:tc>
-          <w:tcPr>
-            <w:tcW w:type="dxa" w:w="2693"/>
-          </w:tcPr>
-          <w:p>
-            <w:r>
-              <w:t>-81%</w:t>
-            </w:r>
-          </w:p>
-        </w:tc>
-        <w:tc>
-          <w:tcPr>
-            <w:tcW w:type="dxa" w:w="2126"/>
-          </w:tcPr>
-          <w:p>
-            <w:r>
-              <w:t>0.5%</w:t>
-            </w:r>
-          </w:p>
-        </w:tc>
-        <w:tc>
-          <w:tcPr>
-            <w:tcW w:type="dxa" w:w="3402"/>
           </w:tcPr>
           <w:p>
             <w:r>

</xml_diff>